<commit_message>
docs: incluir rotulo obligatorio de contenido con IA en los 3 videos
Se agrega como paso fijo de edicion (texto en pantalla durante todo el
video) y como requisito de publicacion, en vez de dejarlo opcional.

Co-Authored-By: Claude Sonnet 5 <noreply@anthropic.com>
Claude-Session: https://claude.ai/code/session_01BGajP5s9F1aLgfyztSAp9Y
</commit_message>
<xml_diff>
--- a/docs/libro/Prompts_Creadora_IA_Video_Libro_IM_Music.docx
+++ b/docs/libro/Prompts_Creadora_IA_Video_Libro_IM_Music.docx
@@ -82,7 +82,7 @@
           <w:color w:val="5E17EB"/>
           <w:sz w:val="32"/>
         </w:rPr>
-        <w:t>⚠️ Antes de empezar — una nota importante</w:t>
+        <w:t>⚠️ Rótulo de contenido con IA — ya incluido</w:t>
       </w:r>
     </w:p>
     <w:p>
@@ -94,7 +94,7 @@
           <w:rFonts w:ascii="Georgia" w:hAnsi="Georgia"/>
           <w:sz w:val="22"/>
         </w:rPr>
-        <w:t xml:space="preserve">Los guiones de esta campaña están escritos en primera persona, como si la creadora hubiera leído el libro de verdad ("lo leí y se los recomiendo"). Eso es exactamente lo que evitaste a propósito en la página de Hotmart ("cero testimonios inventados"). Como esta persona es 100% generada con IA y nunca leyó nada, lo más honesto — y lo que te cubre frente a las políticas de anuncios de Meta/TikTok, que cada vez piden más declarar cuando un anuncio usa un actor generado con IA — es agregar en pantalla o en la descripción algo como </w:t>
+        <w:t xml:space="preserve">Los guiones de esta campaña están escritos en primera persona, como si la creadora hubiera leído el libro de verdad ("lo leí y se los recomiendo"). Como esta persona es 100% generada con IA, cada uno de los 3 videos lleva ahora un rótulo fijo en pantalla </w:t>
       </w:r>
       <w:r>
         <w:rPr>
@@ -110,7 +110,7 @@
           <w:rFonts w:ascii="Georgia" w:hAnsi="Georgia"/>
           <w:sz w:val="22"/>
         </w:rPr>
-        <w:t>. No cambia el guion ni el resultado, pero evita que esto se lea como un testimonio falso de una persona real. Tú decides si lo agregas; te lo dejo marcado para que no se te pase.</w:t>
+        <w:t xml:space="preserve"> (paso a paso en la sección 7, punto de edición) además de la etiqueta en la descripción de cada publicación. No cambia ningún guion — solo evita que esto se lea como un testimonio falso de una persona real, y te cubre frente a las políticas de anuncios de Meta/TikTok sobre actores generados con IA.</w:t>
       </w:r>
     </w:p>
     <w:p>
@@ -914,6 +914,27 @@
       <w:r>
         <w:rPr>
           <w:rFonts w:ascii="Georgia" w:hAnsi="Georgia"/>
+          <w:b/>
+          <w:color w:val="5E17EB"/>
+          <w:sz w:val="22"/>
+        </w:rPr>
+        <w:t>Agrega el rótulo "Contenido generado con IA"</w:t>
+      </w:r>
+      <w:r>
+        <w:rPr>
+          <w:rFonts w:ascii="Georgia" w:hAnsi="Georgia"/>
+          <w:sz w:val="22"/>
+        </w:rPr>
+        <w:t>: un texto pequeño en Anton, esquina superior o inferior, semi-transparente (opacidad ~70%), presente durante TODO el video (no solo un segundo) — en los 3 videos, sin excepción.</w:t>
+      </w:r>
+    </w:p>
+    <w:p>
+      <w:pPr>
+        <w:pStyle w:val="ListNumber"/>
+      </w:pPr>
+      <w:r>
+        <w:rPr>
+          <w:rFonts w:ascii="Georgia" w:hAnsi="Georgia"/>
           <w:sz w:val="22"/>
         </w:rPr>
         <w:t>Cierra cada uno de los 3 videos con el logo de IM Music (outro).</w:t>
@@ -929,6 +950,18 @@
           <w:sz w:val="22"/>
         </w:rPr>
         <w:t>Exporta cada video por separado, vertical 1080x1920 — quedan 3 archivos: frío, tibio, caliente.</w:t>
+      </w:r>
+    </w:p>
+    <w:p>
+      <w:pPr>
+        <w:pStyle w:val="ListNumber"/>
+      </w:pPr>
+      <w:r>
+        <w:rPr>
+          <w:rFonts w:ascii="Georgia" w:hAnsi="Georgia"/>
+          <w:sz w:val="22"/>
+        </w:rPr>
+        <w:t>Al publicar cada video en Instagram/TikTok/YouTube: activa la opción de "contenido generado con IA" si la plataforma la pide, y agrega "🤖 Contenido generado con IA" en la descripción del post.</w:t>
       </w:r>
     </w:p>
     <w:p>
@@ -1014,7 +1047,19 @@
           <w:rFonts w:ascii="Georgia" w:hAnsi="Georgia"/>
           <w:sz w:val="22"/>
         </w:rPr>
-        <w:t>☐ Considera agregar "Contenido generado con IA" en pantalla o en la descripción (ver nota al inicio del documento)</w:t>
+        <w:t>☐ Rótulo "Contenido generado con IA" visible durante todo el video, en las 3 piezas</w:t>
+      </w:r>
+    </w:p>
+    <w:p>
+      <w:pPr>
+        <w:pStyle w:val="ListBullet"/>
+      </w:pPr>
+      <w:r>
+        <w:rPr>
+          <w:rFonts w:ascii="Georgia" w:hAnsi="Georgia"/>
+          <w:sz w:val="22"/>
+        </w:rPr>
+        <w:t>☐ "🤖 Contenido generado con IA" agregado en la descripción de cada publicación</w:t>
       </w:r>
     </w:p>
     <w:p>

</xml_diff>

<commit_message>
docs: agregar prompt maestro unico (plantilla) al final del documento
Una sola plantilla reutilizable para las 10 tomas, en vez de 10 bloques
completos separados.

Co-Authored-By: Claude Sonnet 5 <noreply@anthropic.com>
Claude-Session: https://claude.ai/code/session_01BGajP5s9F1aLgfyztSAp9Y
</commit_message>
<xml_diff>
--- a/docs/libro/Prompts_Creadora_IA_Video_Libro_IM_Music.docx
+++ b/docs/libro/Prompts_Creadora_IA_Video_Libro_IM_Music.docx
@@ -1074,6 +1074,237 @@
         <w:t>☐ No hay afirmaciones falsas o exageradas sobre el libro</w:t>
       </w:r>
     </w:p>
+    <w:p>
+      <w:pPr>
+        <w:spacing w:before="360" w:after="160"/>
+      </w:pPr>
+      <w:r>
+        <w:rPr>
+          <w:rFonts w:ascii="Bahnschrift" w:hAnsi="Bahnschrift"/>
+          <w:b/>
+          <w:color w:val="5E17EB"/>
+          <w:sz w:val="32"/>
+        </w:rPr>
+        <w:t>9. PROMPT MAESTRO ÚNICO (plantilla — la misma para las 10 tomas)</w:t>
+      </w:r>
+    </w:p>
+    <w:p>
+      <w:r>
+        <w:rPr>
+          <w:rFonts w:ascii="Georgia" w:hAnsi="Georgia"/>
+          <w:i/>
+          <w:color w:val="666666"/>
+          <w:sz w:val="20"/>
+        </w:rPr>
+        <w:t>Una sola plantilla. La usas 10 veces, cambiando solo `[CÁMARA]` y `[ACCIÓN+GUIÓN]` por lo de la tabla de abajo. Todo lo demás (identidad, voz, acento) se queda igual siempre.</w:t>
+      </w:r>
+    </w:p>
+    <w:p>
+      <w:pPr>
+        <w:ind w:left="432"/>
+        <w:shd w:val="clear" w:fill="F2EDE5"/>
+      </w:pPr>
+      <w:r>
+        <w:rPr>
+          <w:rFonts w:ascii="Consolas" w:hAnsi="Consolas"/>
+          <w:color w:val="333333"/>
+          <w:sz w:val="19"/>
+        </w:rPr>
+        <w:t>Using the reference image, keep the SAME person — same face and identity, same outfit, same background and lighting.</w:t>
+        <w:br/>
+        <w:br/>
+        <w:t>[CÁMARA — pega aquí el movimiento de cámara de esta toma]</w:t>
+        <w:br/>
+        <w:br/>
+        <w:t>Single continuous take, no cuts or scene changes.</w:t>
+        <w:br/>
+        <w:br/>
+        <w:t>[ACCIÓN opcional — un gesto], she says: "[GUIÓN — pega aquí la línea exacta de esta toma]"</w:t>
+        <w:br/>
+        <w:br/>
+        <w:t>Voice: a youthful female voice — a woman in her mid-20s, bright and fairly high-pitched, light and breezy, casual relaxed pace.</w:t>
+        <w:br/>
+        <w:br/>
+        <w:t>Spanish with a clear, neutral Colombian (Bogotá) accent.</w:t>
+      </w:r>
+    </w:p>
+    <w:p/>
+    <w:p>
+      <w:pPr>
+        <w:spacing w:before="240" w:after="120"/>
+      </w:pPr>
+      <w:r>
+        <w:rPr>
+          <w:rFonts w:ascii="Bahnschrift" w:hAnsi="Bahnschrift"/>
+          <w:b/>
+          <w:color w:val="000000"/>
+          <w:sz w:val="26"/>
+        </w:rPr>
+        <w:t>Los 10 valores a insertar</w:t>
+      </w:r>
+    </w:p>
+    <w:p>
+      <w:pPr>
+        <w:spacing w:after="160"/>
+      </w:pPr>
+      <w:r>
+        <w:rPr>
+          <w:rFonts w:ascii="Georgia" w:hAnsi="Georgia"/>
+          <w:b/>
+          <w:color w:val="5E17EB"/>
+          <w:sz w:val="22"/>
+        </w:rPr>
+        <w:t>VIDEO 1 — FRÍA</w:t>
+      </w:r>
+    </w:p>
+    <w:p>
+      <w:pPr>
+        <w:pStyle w:val="ListNumber"/>
+      </w:pPr>
+      <w:r>
+        <w:rPr>
+          <w:rFonts w:ascii="Georgia" w:hAnsi="Georgia"/>
+          <w:sz w:val="22"/>
+        </w:rPr>
+        <w:t>`[CÁMARA]`: Slow, continuous zoom-in toward the subject's face, holding on the close-up. → `[ACCIÓN+GUIÓN]`: with a serious expression, "¿Sabes cuánto dinero de tu música se está quedando en el camino ahora mismo, sin que te enteres?"</w:t>
+      </w:r>
+    </w:p>
+    <w:p>
+      <w:pPr>
+        <w:pStyle w:val="ListNumber"/>
+      </w:pPr>
+      <w:r>
+        <w:rPr>
+          <w:rFonts w:ascii="Georgia" w:hAnsi="Georgia"/>
+          <w:sz w:val="22"/>
+        </w:rPr>
+        <w:t>`[CÁMARA]`: (static camera, no movement) realistic arm movements. → raising one hand slightly, "Cada vez que suena tu canción, hay un pago que te corresponde. Y la mayoría de artistas independientes nunca lo cobra."</w:t>
+      </w:r>
+    </w:p>
+    <w:p>
+      <w:pPr>
+        <w:pStyle w:val="ListNumber"/>
+      </w:pPr>
+      <w:r>
+        <w:rPr>
+          <w:rFonts w:ascii="Georgia" w:hAnsi="Georgia"/>
+          <w:sz w:val="22"/>
+        </w:rPr>
+        <w:t>`[CÁMARA]`: Very gentle slow push-in, medium to medium close-up. → nodding slowly, "No es falta de talento. Es que nadie te explicó cómo funciona el negocio detrás de la música. Por eso leí este libro."</w:t>
+      </w:r>
+    </w:p>
+    <w:p>
+      <w:pPr>
+        <w:pStyle w:val="ListNumber"/>
+      </w:pPr>
+      <w:r>
+        <w:rPr>
+          <w:rFonts w:ascii="Georgia" w:hAnsi="Georgia"/>
+          <w:sz w:val="22"/>
+        </w:rPr>
+        <w:t>`[CÁMARA]`: (static camera, no movement) realistic arm movements. → pointing up, "Music Business Para Todos Los Humanos. Búscalo en el link de la bio antes de tu próximo lanzamiento, no después."</w:t>
+      </w:r>
+    </w:p>
+    <w:p>
+      <w:pPr>
+        <w:spacing w:after="160"/>
+      </w:pPr>
+      <w:r>
+        <w:rPr>
+          <w:rFonts w:ascii="Georgia" w:hAnsi="Georgia"/>
+          <w:b/>
+          <w:color w:val="5E17EB"/>
+          <w:sz w:val="22"/>
+        </w:rPr>
+        <w:t>VIDEO 2 — TIBIA</w:t>
+      </w:r>
+    </w:p>
+    <w:p>
+      <w:pPr>
+        <w:pStyle w:val="ListNumber"/>
+      </w:pPr>
+      <w:r>
+        <w:rPr>
+          <w:rFonts w:ascii="Georgia" w:hAnsi="Georgia"/>
+          <w:sz w:val="22"/>
+        </w:rPr>
+        <w:t>`[CÁMARA]`: Slow subtle push-in, cinematic. → tilting her head curiously, "Si haces música, hay algo que probablemente no sabes sobre tus regalías, tus contratos o tu marca."</w:t>
+      </w:r>
+    </w:p>
+    <w:p>
+      <w:pPr>
+        <w:pStyle w:val="ListNumber"/>
+      </w:pPr>
+      <w:r>
+        <w:rPr>
+          <w:rFonts w:ascii="Georgia" w:hAnsi="Georgia"/>
+          <w:sz w:val="22"/>
+        </w:rPr>
+        <w:t>`[CÁMARA]`: (static camera, no movement) realistic arm movements. → smiling slightly, "Yo tampoco lo sabía, hasta que leí un libro que me cambió completamente cómo veo esto."</w:t>
+      </w:r>
+    </w:p>
+    <w:p>
+      <w:pPr>
+        <w:pStyle w:val="ListNumber"/>
+      </w:pPr>
+      <w:r>
+        <w:rPr>
+          <w:rFonts w:ascii="Georgia" w:hAnsi="Georgia"/>
+          <w:sz w:val="22"/>
+        </w:rPr>
+        <w:t>`[CÁMARA]`: Slow, continuous zoom-in, holding on close-up. → "Si quieres que te cuente qué aprendí, comenta LIBRO y te cuento."</w:t>
+      </w:r>
+    </w:p>
+    <w:p>
+      <w:pPr>
+        <w:spacing w:after="160"/>
+      </w:pPr>
+      <w:r>
+        <w:rPr>
+          <w:rFonts w:ascii="Georgia" w:hAnsi="Georgia"/>
+          <w:b/>
+          <w:color w:val="5E17EB"/>
+          <w:sz w:val="22"/>
+        </w:rPr>
+        <w:t>VIDEO 3 — CALIENTE</w:t>
+      </w:r>
+    </w:p>
+    <w:p>
+      <w:pPr>
+        <w:pStyle w:val="ListNumber"/>
+      </w:pPr>
+      <w:r>
+        <w:rPr>
+          <w:rFonts w:ascii="Georgia" w:hAnsi="Georgia"/>
+          <w:sz w:val="22"/>
+        </w:rPr>
+        <w:t>`[CÁMARA]`: (static camera, no movement) realistic arm movements. → with direct, confident energy, "Leí este libro y es excelente. Se los recomiendo."</w:t>
+      </w:r>
+    </w:p>
+    <w:p>
+      <w:pPr>
+        <w:pStyle w:val="ListNumber"/>
+      </w:pPr>
+      <w:r>
+        <w:rPr>
+          <w:rFonts w:ascii="Georgia" w:hAnsi="Georgia"/>
+          <w:sz w:val="22"/>
+        </w:rPr>
+        <w:t>`[CÁMARA]`: Very gentle slow push-in, medium to medium close-up. → counting briefly on her fingers, "Habla de derechos, contratos, cómo se reparte de verdad el dinero de Spotify, marca, hasta inteligencia artificial en la industria musical. Lo escribió IM Music, un sello discográfico independiente que está operando ahora mismo."</w:t>
+      </w:r>
+    </w:p>
+    <w:p>
+      <w:pPr>
+        <w:pStyle w:val="ListNumber"/>
+      </w:pPr>
+      <w:r>
+        <w:rPr>
+          <w:rFonts w:ascii="Georgia" w:hAnsi="Georgia"/>
+          <w:sz w:val="22"/>
+        </w:rPr>
+        <w:t>`[CÁMARA]`: (static camera, no movement) realistic arm movements. → holding up her hands slightly, "Dieciséis con noventa dólares, noventa y dos páginas. Por lo que cuesta, no hay comparación con lo que te puede ahorrar. Consíganlo antes de su próximo lanzamiento — link en bio."</w:t>
+      </w:r>
+    </w:p>
     <w:sectPr>
       <w:pgSz w:w="12240" w:h="15840"/>
       <w:pgMar w:top="1152" w:right="1152" w:bottom="1152" w:left="1152" w:header="720" w:footer="720" w:gutter="0"/>

</xml_diff>

<commit_message>
docs: hacer el vestuario de la creadora IA mas urbano/streetwear
Co-Authored-By: Claude Sonnet 5 <noreply@anthropic.com>
Claude-Session: https://claude.ai/code/session_01BGajP5s9F1aLgfyztSAp9Y
</commit_message>
<xml_diff>
--- a/docs/libro/Prompts_Creadora_IA_Video_Libro_IM_Music.docx
+++ b/docs/libro/Prompts_Creadora_IA_Video_Libro_IM_Music.docx
@@ -136,7 +136,7 @@
           <w:rFonts w:ascii="Georgia" w:hAnsi="Georgia"/>
           <w:sz w:val="22"/>
         </w:rPr>
-        <w:t xml:space="preserve">Persona: mujer, ~25-28 años, look urbano-profesional, cercana pero con autoridad — coherente con la identidad REBEL LUXURY de IM Music. Voz e imagen se mantienen </w:t>
+        <w:t xml:space="preserve">Persona: mujer, ~25-28 años, look urbano/streetwear (bomber, cargo, sneakers, cadenas, argollas grandes), cercana pero con autoridad — coherente con la identidad REBEL LUXURY de IM Music. Voz e imagen se mantienen </w:t>
       </w:r>
       <w:r>
         <w:rPr>
@@ -260,10 +260,10 @@
         <w:t>Shot vertically as an iPhone photo, eye-level framing, medium portrait composition, natural smartphone lens look, authentic social media reel aesthetic.</w:t>
         <w:br/>
         <w:br/>
-        <w:t>She is wearing an oversized black leather jacket over a fitted white top, dark jeans, small gold hoop earrings, and a thin bracelet with a subtle deep violet stone accent visible at the wrist.</w:t>
+        <w:t>She is wearing an oversized black bomber jacket with subtle streetwear branding over a cropped graphic tank top, baggy cargo pants, chunky white sneakers, large gold hoop earrings, a couple of thin layered chains, and a chunky ring — urban streetwear look, hip-hop/urban-artist coherent. One visible bracelet carries a subtle deep violet stone accent at the wrist as the brand touch.</w:t>
         <w:br/>
         <w:br/>
-        <w:t>Standing against a dark matte wall with a single soft violet-toned LED light strip glowing along one edge of the frame, minimal urban background, uncluttered composition that keeps all attention on the subject.</w:t>
+        <w:t>Standing against a dark matte wall with graffiti-style texture, a single soft violet-toned LED light strip glowing along one edge of the frame, minimal urban background (concrete, industrial), uncluttered composition that keeps all attention on the subject.</w:t>
         <w:br/>
         <w:br/>
         <w:t>Soft natural daylight combined with the subtle violet accent light and a gentle direct iPhone flash for crisp facial detail, gentle contrast, slight grain, candid dump vibe, realistic lighting, authentic smartphone capture.</w:t>

</xml_diff>

<commit_message>
docs: agregar pasamontanas violeta de marca a la creadora IA
Co-Authored-By: Claude Sonnet 5 <noreply@anthropic.com>
Claude-Session: https://claude.ai/code/session_01BGajP5s9F1aLgfyztSAp9Y
</commit_message>
<xml_diff>
--- a/docs/libro/Prompts_Creadora_IA_Video_Libro_IM_Music.docx
+++ b/docs/libro/Prompts_Creadora_IA_Video_Libro_IM_Music.docx
@@ -136,7 +136,23 @@
           <w:rFonts w:ascii="Georgia" w:hAnsi="Georgia"/>
           <w:sz w:val="22"/>
         </w:rPr>
-        <w:t xml:space="preserve">Persona: mujer, ~25-28 años, look urbano/streetwear (bomber, cargo, sneakers, cadenas, argollas grandes), cercana pero con autoridad — coherente con la identidad REBEL LUXURY de IM Music. Voz e imagen se mantienen </w:t>
+        <w:t xml:space="preserve">Persona: mujer, ~25-28 años, look urbano/streetwear (bomber, cargo, sneakers, cadenas, argollas grandes) + </w:t>
+      </w:r>
+      <w:r>
+        <w:rPr>
+          <w:rFonts w:ascii="Georgia" w:hAnsi="Georgia"/>
+          <w:b/>
+          <w:color w:val="5E17EB"/>
+          <w:sz w:val="22"/>
+        </w:rPr>
+        <w:t>pasamontañas violeta de marca</w:t>
+      </w:r>
+      <w:r>
+        <w:rPr>
+          <w:rFonts w:ascii="Georgia" w:hAnsi="Georgia"/>
+          <w:sz w:val="22"/>
+        </w:rPr>
+        <w:t xml:space="preserve"> que cubre cabello y cuello dejando toda la cara descubierta (ojos, nariz, boca, mentón) — cercana pero con un toque de misterio/anonimato, coherente con la identidad REBEL LUXURY de IM Music. Voz e imagen se mantienen </w:t>
       </w:r>
       <w:r>
         <w:rPr>
@@ -215,7 +231,7 @@
           <w:rFonts w:ascii="Georgia" w:hAnsi="Georgia"/>
           <w:sz w:val="22"/>
         </w:rPr>
-        <w:t xml:space="preserve"> un acento violeta `#5E17EB` sutil en el vestuario/iluminación (no en el fondo completo) — igual que se le pide al creador humano en el otro brief.</w:t>
+        <w:t xml:space="preserve"> el pasamontañas en violeta exacto `#5E17EB` es ahora el elemento de marca principal (reemplaza el acento sutil en pulsera de la versión anterior) — muy visible, pero SIEMPRE con la cara completamente descubierta para que se pueda hablar y sincronizar labios sin problema.</w:t>
       </w:r>
     </w:p>
     <w:p>
@@ -254,13 +270,13 @@
           <w:color w:val="333333"/>
           <w:sz w:val="19"/>
         </w:rPr>
-        <w:t>A candid iPhone photo of a stylish Latina content creator in her mid-20s, medium olive-tan skin, expressive dark brown eyes, naturally full brows, soft natural makeup, long dark brown wavy hair worn down with natural loose texture. She has realistic skin texture with visible pores, subtle natural imperfections. She is speaking directly to the camera, headphones resting around her neck, holding a small wireless microphone with a fluffy windscreen close to her mouth, friendly and confident expression.</w:t>
+        <w:t>A candid iPhone photo of a stylish Latina content creator in her mid-20s, medium olive-tan skin, expressive dark brown eyes, naturally full brows, soft natural makeup on the visible skin, realistic skin texture with visible pores, subtle natural imperfections. She wears a fitted deep violet balaclava (ski mask) in the exact brand violet tone (#5E17EB), covering her hair, ears, neck and the top of her head, with an open face cutout that fully exposes her eyes, nose, mouth and chin — the mask frames the face but never covers it, so her expressions and mouth movement while talking stay completely visible. She is speaking directly to the camera, headphones resting around her neck over the balaclava, holding a small wireless microphone with a fluffy windscreen close to her mouth, friendly and confident expression.</w:t>
         <w:br/>
         <w:br/>
         <w:t>Shot vertically as an iPhone photo, eye-level framing, medium portrait composition, natural smartphone lens look, authentic social media reel aesthetic.</w:t>
         <w:br/>
         <w:br/>
-        <w:t>She is wearing an oversized black bomber jacket with subtle streetwear branding over a cropped graphic tank top, baggy cargo pants, chunky white sneakers, large gold hoop earrings, a couple of thin layered chains, and a chunky ring — urban streetwear look, hip-hop/urban-artist coherent. One visible bracelet carries a subtle deep violet stone accent at the wrist as the brand touch.</w:t>
+        <w:t>She is wearing an oversized black bomber jacket with subtle streetwear branding over a cropped graphic tank top, baggy cargo pants, chunky white sneakers, large gold hoop earrings, a couple of thin layered chains, and a chunky ring — urban streetwear look, hip-hop/urban-artist coherent, mysterious/anonymous vibe reinforced by the violet balaclava as the main brand signature.</w:t>
         <w:br/>
         <w:br/>
         <w:t>Standing against a dark matte wall with graffiti-style texture, a single soft violet-toned LED light strip glowing along one edge of the frame, minimal urban background (concrete, industrial), uncluttered composition that keeps all attention on the subject.</w:t>
@@ -269,7 +285,7 @@
         <w:t>Soft natural daylight combined with the subtle violet accent light and a gentle direct iPhone flash for crisp facial detail, gentle contrast, slight grain, candid dump vibe, realistic lighting, authentic smartphone capture.</w:t>
         <w:br/>
         <w:br/>
-        <w:t>Maintain the same pose, hairstyle, outfit, framing, expression, background, and overall composition. Preserve realistic proportions, accurate hands and facial features, natural skin texture, true-to-life colors, sharp focus, Instagram influencer aesthetic, iPhone photo realism.</w:t>
+        <w:t>Maintain the same pose, balaclava color and fit, outfit, framing, expression, background, and overall composition. Preserve realistic proportions, accurate hands and facial features on the exposed part of the face, natural skin texture, true-to-life colors, sharp focus, Instagram influencer aesthetic, iPhone photo realism.</w:t>
         <w:br/>
         <w:br/>
         <w:t>No text, no watermark, no distortion.</w:t>
@@ -315,13 +331,13 @@
         <w:t>Using the reference image as the ONLY source of identity, generate a professional 3×3 character sheet showing the exact same person from multiple angles and expressions.</w:t>
         <w:br/>
         <w:br/>
-        <w:t>The identity must remain absolutely identical to the reference: same facial structure, same eye shape and spacing, same nose, same lips, same jawline, same hairstyle and hairline, same skin tone, same proportions, same age, same ethnicity, same facial asymmetries and unique identifying features. Do NOT beautify, stylize, or reinterpret the person in any way.</w:t>
+        <w:t>The identity must remain absolutely identical to the reference: same facial structure on the exposed part of the face, same eye shape and spacing, same nose, same lips, same jawline, same skin tone, same proportions, same age, same ethnicity, same facial asymmetries and unique identifying features. The deep violet balaclava (#5E17EB) must keep the exact same color, fit and face cutout in every portrait, always leaving eyes, nose, mouth and chin fully exposed. Do NOT beautify, stylize, or reinterpret the person in any way.</w:t>
         <w:br/>
         <w:br/>
         <w:t>Create a clean character sheet with nine evenly spaced portraits on a neutral light gray background. Include: front view (neutral), left profile (90°), right profile (90°), left three-quarter view, right three-quarter view, slight downward gaze, slight upward gaze, serious expression, neutral expression.</w:t>
         <w:br/>
         <w:br/>
-        <w:t>Lighting should be soft and perfectly consistent across every frame. Hair, clothing, makeup and accessories must remain identical in every portrait. Ultra high realism. Extremely accurate identity preservation. No artistic interpretation, no beauty filters, no skin smoothing.</w:t>
+        <w:t>Lighting should be soft and perfectly consistent across every frame. Balaclava, clothing, makeup and accessories must remain identical in every portrait. Ultra high realism. Extremely accurate identity preservation. No artistic interpretation, no beauty filters, no skin smoothing.</w:t>
       </w:r>
     </w:p>
     <w:p/>

</xml_diff>

<commit_message>
docs: cambiar pasamontanas por gorro de lana violeta (cara descubierta)
Co-Authored-By: Claude Sonnet 5 <noreply@anthropic.com>
Claude-Session: https://claude.ai/code/session_01BGajP5s9F1aLgfyztSAp9Y
</commit_message>
<xml_diff>
--- a/docs/libro/Prompts_Creadora_IA_Video_Libro_IM_Music.docx
+++ b/docs/libro/Prompts_Creadora_IA_Video_Libro_IM_Music.docx
@@ -145,14 +145,14 @@
           <w:color w:val="5E17EB"/>
           <w:sz w:val="22"/>
         </w:rPr>
-        <w:t>pasamontañas violeta de marca</w:t>
+        <w:t>gorro de lana (beanie) violeta de marca</w:t>
       </w:r>
       <w:r>
         <w:rPr>
           <w:rFonts w:ascii="Georgia" w:hAnsi="Georgia"/>
           <w:sz w:val="22"/>
         </w:rPr>
-        <w:t xml:space="preserve"> que cubre cabello y cuello dejando toda la cara descubierta (ojos, nariz, boca, mentón) — cercana pero con un toque de misterio/anonimato, coherente con la identidad REBEL LUXURY de IM Music. Voz e imagen se mantienen </w:t>
+        <w:t xml:space="preserve"> puesto normal en la cabeza — cara completamente visible y descubierta en todo momento, solo cambia el gorro. Cercana pero con autoridad, coherente con la identidad REBEL LUXURY de IM Music. Voz e imagen se mantienen </w:t>
       </w:r>
       <w:r>
         <w:rPr>
@@ -231,7 +231,7 @@
           <w:rFonts w:ascii="Georgia" w:hAnsi="Georgia"/>
           <w:sz w:val="22"/>
         </w:rPr>
-        <w:t xml:space="preserve"> el pasamontañas en violeta exacto `#5E17EB` es ahora el elemento de marca principal (reemplaza el acento sutil en pulsera de la versión anterior) — muy visible, pero SIEMPRE con la cara completamente descubierta para que se pueda hablar y sincronizar labios sin problema.</w:t>
+        <w:t xml:space="preserve"> el gorro de lana en violeta exacto `#5E17EB` es el elemento de marca principal — muy visible, siempre puesto como un beanie normal (nunca cubriendo la cara).</w:t>
       </w:r>
     </w:p>
     <w:p>
@@ -270,13 +270,13 @@
           <w:color w:val="333333"/>
           <w:sz w:val="19"/>
         </w:rPr>
-        <w:t>A candid iPhone photo of a stylish Latina content creator in her mid-20s, medium olive-tan skin, expressive dark brown eyes, naturally full brows, soft natural makeup on the visible skin, realistic skin texture with visible pores, subtle natural imperfections. She wears a fitted deep violet balaclava (ski mask) in the exact brand violet tone (#5E17EB), covering her hair, ears, neck and the top of her head, with an open face cutout that fully exposes her eyes, nose, mouth and chin — the mask frames the face but never covers it, so her expressions and mouth movement while talking stay completely visible. She is speaking directly to the camera, headphones resting around her neck over the balaclava, holding a small wireless microphone with a fluffy windscreen close to her mouth, friendly and confident expression.</w:t>
+        <w:t>A candid iPhone photo of a stylish Latina content creator in her mid-20s, medium olive-tan skin, expressive dark brown eyes, naturally full brows, soft natural makeup, realistic skin texture with visible pores, subtle natural imperfections. She wears a fitted deep violet knit beanie (gorro de lana) in the exact brand violet tone (#5E17EB), worn normally on top of the head like a regular streetwear beanie — it does NOT cover the face at all, her full face stays completely visible (forehead, eyes, nose, mouth, chin, jaw), only a bit of hair peeks out from under the edge of the beanie. She is speaking directly to the camera, headphones resting around her neck, holding a small wireless microphone with a fluffy windscreen close to her mouth, friendly and confident expression.</w:t>
         <w:br/>
         <w:br/>
         <w:t>Shot vertically as an iPhone photo, eye-level framing, medium portrait composition, natural smartphone lens look, authentic social media reel aesthetic.</w:t>
         <w:br/>
         <w:br/>
-        <w:t>She is wearing an oversized black bomber jacket with subtle streetwear branding over a cropped graphic tank top, baggy cargo pants, chunky white sneakers, large gold hoop earrings, a couple of thin layered chains, and a chunky ring — urban streetwear look, hip-hop/urban-artist coherent, mysterious/anonymous vibe reinforced by the violet balaclava as the main brand signature.</w:t>
+        <w:t>She is wearing an oversized black bomber jacket with subtle streetwear branding over a cropped graphic tank top, baggy cargo pants, chunky white sneakers, large gold hoop earrings, a couple of thin layered chains, and a chunky ring — urban streetwear look, hip-hop/urban-artist coherent, with the violet beanie as the main brand signature.</w:t>
         <w:br/>
         <w:br/>
         <w:t>Standing against a dark matte wall with graffiti-style texture, a single soft violet-toned LED light strip glowing along one edge of the frame, minimal urban background (concrete, industrial), uncluttered composition that keeps all attention on the subject.</w:t>
@@ -285,7 +285,7 @@
         <w:t>Soft natural daylight combined with the subtle violet accent light and a gentle direct iPhone flash for crisp facial detail, gentle contrast, slight grain, candid dump vibe, realistic lighting, authentic smartphone capture.</w:t>
         <w:br/>
         <w:br/>
-        <w:t>Maintain the same pose, balaclava color and fit, outfit, framing, expression, background, and overall composition. Preserve realistic proportions, accurate hands and facial features on the exposed part of the face, natural skin texture, true-to-life colors, sharp focus, Instagram influencer aesthetic, iPhone photo realism.</w:t>
+        <w:t>Maintain the same pose, beanie color and fit, outfit, framing, expression, background, and overall composition. Preserve realistic proportions, accurate hands and facial features, natural skin texture, true-to-life colors, sharp focus, Instagram influencer aesthetic, iPhone photo realism.</w:t>
         <w:br/>
         <w:br/>
         <w:t>No text, no watermark, no distortion.</w:t>
@@ -331,13 +331,13 @@
         <w:t>Using the reference image as the ONLY source of identity, generate a professional 3×3 character sheet showing the exact same person from multiple angles and expressions.</w:t>
         <w:br/>
         <w:br/>
-        <w:t>The identity must remain absolutely identical to the reference: same facial structure on the exposed part of the face, same eye shape and spacing, same nose, same lips, same jawline, same skin tone, same proportions, same age, same ethnicity, same facial asymmetries and unique identifying features. The deep violet balaclava (#5E17EB) must keep the exact same color, fit and face cutout in every portrait, always leaving eyes, nose, mouth and chin fully exposed. Do NOT beautify, stylize, or reinterpret the person in any way.</w:t>
+        <w:t>The identity must remain absolutely identical to the reference: same facial structure, same eye shape and spacing, same nose, same lips, same jawline, same skin tone, same proportions, same age, same ethnicity, same facial asymmetries and unique identifying features. Her full face must stay completely visible in every portrait — the violet knit beanie (#5E17EB) never covers the face, it only sits on top of the head like a normal beanie, same color and fit in every frame. Do NOT beautify, stylize, or reinterpret the person in any way.</w:t>
         <w:br/>
         <w:br/>
         <w:t>Create a clean character sheet with nine evenly spaced portraits on a neutral light gray background. Include: front view (neutral), left profile (90°), right profile (90°), left three-quarter view, right three-quarter view, slight downward gaze, slight upward gaze, serious expression, neutral expression.</w:t>
         <w:br/>
         <w:br/>
-        <w:t>Lighting should be soft and perfectly consistent across every frame. Balaclava, clothing, makeup and accessories must remain identical in every portrait. Ultra high realism. Extremely accurate identity preservation. No artistic interpretation, no beauty filters, no skin smoothing.</w:t>
+        <w:t>Lighting should be soft and perfectly consistent across every frame. Beanie, clothing, makeup and accessories must remain identical in every portrait. Ultra high realism. Extremely accurate identity preservation. No artistic interpretation, no beauty filters, no skin smoothing.</w:t>
       </w:r>
     </w:p>
     <w:p/>

</xml_diff>

<commit_message>
docs: hacer a la creadora IA mucho mas atractiva (belleza nivel modelo)
Co-Authored-By: Claude Sonnet 5 <noreply@anthropic.com>
Claude-Session: https://claude.ai/code/session_01BGajP5s9F1aLgfyztSAp9Y
</commit_message>
<xml_diff>
--- a/docs/libro/Prompts_Creadora_IA_Video_Libro_IM_Music.docx
+++ b/docs/libro/Prompts_Creadora_IA_Video_Libro_IM_Music.docx
@@ -136,7 +136,23 @@
           <w:rFonts w:ascii="Georgia" w:hAnsi="Georgia"/>
           <w:sz w:val="22"/>
         </w:rPr>
-        <w:t xml:space="preserve">Persona: mujer, ~25-28 años, look urbano/streetwear (bomber, cargo, sneakers, cadenas, argollas grandes) + </w:t>
+        <w:t xml:space="preserve">Persona: mujer, ~25-28 años, </w:t>
+      </w:r>
+      <w:r>
+        <w:rPr>
+          <w:rFonts w:ascii="Georgia" w:hAnsi="Georgia"/>
+          <w:b/>
+          <w:color w:val="5E17EB"/>
+          <w:sz w:val="22"/>
+        </w:rPr>
+        <w:t>extremadamente atractiva, belleza nivel modelo</w:t>
+      </w:r>
+      <w:r>
+        <w:rPr>
+          <w:rFonts w:ascii="Georgia" w:hAnsi="Georgia"/>
+          <w:sz w:val="22"/>
+        </w:rPr>
+        <w:t xml:space="preserve"> — rasgos marcados y simétricos, mirada magnética, glam natural. Es justamente esa belleza la que debe detener el scroll. Look urbano/streetwear (bomber, cargo, sneakers, cadenas, argollas grandes) + </w:t>
       </w:r>
       <w:r>
         <w:rPr>
@@ -270,7 +286,7 @@
           <w:color w:val="333333"/>
           <w:sz w:val="19"/>
         </w:rPr>
-        <w:t>A candid iPhone photo of a stylish Latina content creator in her mid-20s, medium olive-tan skin, expressive dark brown eyes, naturally full brows, soft natural makeup, realistic skin texture with visible pores, subtle natural imperfections. She wears a fitted deep violet knit beanie (gorro de lana) in the exact brand violet tone (#5E17EB), worn normally on top of the head like a regular streetwear beanie — it does NOT cover the face at all, her full face stays completely visible (forehead, eyes, nose, mouth, chin, jaw), only a bit of hair peeks out from under the edge of the beanie. She is speaking directly to the camera, headphones resting around her neck, holding a small wireless microphone with a fluffy windscreen close to her mouth, friendly and confident expression.</w:t>
+        <w:t>A candid iPhone photo of a stunningly beautiful Latina content creator in her mid-20s, model-level attractiveness, flawless symmetrical facial features, striking large expressive dark brown eyes with long lashes, high cheekbones, smooth glowing medium olive-tan skin, naturally full arched brows, plump defined lips, soft glam natural makeup (subtle contour, glossy lips, soft eyeliner), realistic skin texture with fine natural detail — the kind of face that stops the scroll on its own. She wears a fitted deep violet knit beanie (gorro de lana) in the exact brand violet tone (#5E17EB), worn normally on top of the head like a regular streetwear beanie — it does NOT cover the face at all, her full face stays completely visible (forehead, eyes, nose, mouth, chin, jaw), only a bit of glossy dark hair peeks out from under the edge of the beanie. She is speaking directly to the camera, headphones resting around her neck, holding a small wireless microphone with a fluffy windscreen close to her mouth, warm confident smile, magnetic screen presence.</w:t>
         <w:br/>
         <w:br/>
         <w:t>Shot vertically as an iPhone photo, eye-level framing, medium portrait composition, natural smartphone lens look, authentic social media reel aesthetic.</w:t>
@@ -285,7 +301,7 @@
         <w:t>Soft natural daylight combined with the subtle violet accent light and a gentle direct iPhone flash for crisp facial detail, gentle contrast, slight grain, candid dump vibe, realistic lighting, authentic smartphone capture.</w:t>
         <w:br/>
         <w:br/>
-        <w:t>Maintain the same pose, beanie color and fit, outfit, framing, expression, background, and overall composition. Preserve realistic proportions, accurate hands and facial features, natural skin texture, true-to-life colors, sharp focus, Instagram influencer aesthetic, iPhone photo realism.</w:t>
+        <w:t>Maintain the same pose, beanie color and fit, outfit, framing, expression, background, and overall composition. Preserve realistic proportions, accurate hands and facial features, striking model-level beauty, natural skin texture, true-to-life colors, sharp focus, Instagram influencer aesthetic, iPhone photo realism.</w:t>
         <w:br/>
         <w:br/>
         <w:t>No text, no watermark, no distortion.</w:t>
@@ -331,7 +347,7 @@
         <w:t>Using the reference image as the ONLY source of identity, generate a professional 3×3 character sheet showing the exact same person from multiple angles and expressions.</w:t>
         <w:br/>
         <w:br/>
-        <w:t>The identity must remain absolutely identical to the reference: same facial structure, same eye shape and spacing, same nose, same lips, same jawline, same skin tone, same proportions, same age, same ethnicity, same facial asymmetries and unique identifying features. Her full face must stay completely visible in every portrait — the violet knit beanie (#5E17EB) never covers the face, it only sits on top of the head like a normal beanie, same color and fit in every frame. Do NOT beautify, stylize, or reinterpret the person in any way.</w:t>
+        <w:t>The identity must remain absolutely identical to the reference: same striking model-level beautiful facial structure, same eye shape and spacing, same nose, same lips, same jawline, same skin tone, same proportions, same age, same ethnicity, same unique identifying features. Her full face must stay completely visible in every portrait — the violet knit beanie (#5E17EB) never covers the face, it only sits on top of the head like a normal beanie, same color and fit in every frame. Do NOT change or downgrade her attractiveness — keep the exact same flawless, glam-model look in every angle.</w:t>
         <w:br/>
         <w:br/>
         <w:t>Create a clean character sheet with nine evenly spaced portraits on a neutral light gray background. Include: front view (neutral), left profile (90°), right profile (90°), left three-quarter view, right three-quarter view, slight downward gaze, slight upward gaze, serious expression, neutral expression.</w:t>

</xml_diff>

<commit_message>
docs: agregar control anti-artefactos a los 10 prompts de video (manos, ojos, objetos)
Co-Authored-By: Claude Sonnet 5 <noreply@anthropic.com>
Claude-Session: https://claude.ai/code/session_01BGajP5s9F1aLgfyztSAp9Y
</commit_message>
<xml_diff>
--- a/docs/libro/Prompts_Creadora_IA_Video_Libro_IM_Music.docx
+++ b/docs/libro/Prompts_Creadora_IA_Video_Libro_IM_Music.docx
@@ -412,6 +412,27 @@
     </w:p>
     <w:p>
       <w:pPr>
+        <w:spacing w:after="160"/>
+      </w:pPr>
+      <w:r>
+        <w:rPr>
+          <w:rFonts w:ascii="Georgia" w:hAnsi="Georgia"/>
+          <w:b/>
+          <w:color w:val="5E17EB"/>
+          <w:sz w:val="22"/>
+        </w:rPr>
+        <w:t>Sobre manos duplicadas, ojos raros, objetos que aparecen de la nada:</w:t>
+      </w:r>
+      <w:r>
+        <w:rPr>
+          <w:rFonts w:ascii="Georgia" w:hAnsi="Georgia"/>
+          <w:sz w:val="22"/>
+        </w:rPr>
+        <w:t xml:space="preserve"> todos los prompts de video (secciones 4, 5, 6 y la plantilla de la sección 9) ya incluyen ahora una frase fija de control de anatomía justo después de "Single continuous take, no cuts or scene changes." — obliga al modelo a mantener exactamente dos manos con cinco dedos, prohíbe que aparezcan objetos no descritos (como el libro saliendo de la nada), y pide contacto visual estable con parpadeo normal. Si el video generado sigue mostrando manos de más u objetos raros, es una limitación del modelo en ese clip puntual — regenera ese clip 1-2 veces más, casi siempre cambia el resultado.</w:t>
+      </w:r>
+    </w:p>
+    <w:p>
+      <w:pPr>
         <w:spacing w:before="360" w:after="160"/>
       </w:pPr>
       <w:r>
@@ -461,7 +482,7 @@
           <w:color w:val="333333"/>
           <w:sz w:val="19"/>
         </w:rPr>
-        <w:t>Slow, continuous zoom-in toward the subject's face, starting from the very first frame and moving steadily closer, then holding steady on the close-up for the rest of the clip. Single continuous take, no cuts or scene changes. She looks directly at the camera with a serious, confessional expression and says: "¿Sabes cuánto dinero de tu música se está quedando en el camino ahora mismo, sin que te enteres?"</w:t>
+        <w:t>Slow, continuous zoom-in toward the subject's face, starting from the very first frame and moving steadily closer, then holding steady on the close-up for the rest of the clip. Single continuous take, no cuts or scene changes. Anatomically correct body at all times: exactly two arms and two hands, five fingers per hand, no extra, duplicated, blurred, or merged limbs, no distorted or morphing anatomy. Do not add any props, objects, books, papers, phones, or items that are not explicitly described in this prompt — her hands stay empty and either still or performing only the exact gesture written below, nothing appears out of nowhere. Natural steady eye contact with the camera, normal human blink rate, no jittery, rapid, wandering, crossed, or distorted eye movement. Any gesture must be slow, subtle, and anatomically natural — no exaggerated, rapid, jerky, or repeated movement, no extra limbs appearing during the gesture. She looks directly at the camera with a serious, confessional expression and says: "¿Sabes cuánto dinero de tu música se está quedando en el camino ahora mismo, sin que te enteres?"</w:t>
         <w:br/>
         <w:br/>
         <w:t>Voice: a youthful female voice — a woman in her mid-20s, bright and fairly high-pitched, light and breezy, casual relaxed pace.</w:t>
@@ -496,7 +517,7 @@
           <w:color w:val="333333"/>
           <w:sz w:val="19"/>
         </w:rPr>
-        <w:t>(static camera, no movement) realistic arm movements and subtle micro-movements. Single continuous take, no cuts or scene changes. She raises one hand slightly as she explains, then says: "Cada vez que suena tu canción, hay un pago que te corresponde. Y la mayoría de artistas independientes nunca lo cobra."</w:t>
+        <w:t>(static camera, no movement) realistic arm movements and subtle micro-movements. Single continuous take, no cuts or scene changes. Anatomically correct body at all times: exactly two arms and two hands, five fingers per hand, no extra, duplicated, blurred, or merged limbs, no distorted or morphing anatomy. Do not add any props, objects, books, papers, phones, or items that are not explicitly described in this prompt — her hands stay empty and either still or performing only the exact gesture written below, nothing appears out of nowhere. Natural steady eye contact with the camera, normal human blink rate, no jittery, rapid, wandering, crossed, or distorted eye movement. Any gesture must be slow, subtle, and anatomically natural — no exaggerated, rapid, jerky, or repeated movement, no extra limbs appearing during the gesture. She raises one hand slightly as she explains, then says: "Cada vez que suena tu canción, hay un pago que te corresponde. Y la mayoría de artistas independientes nunca lo cobra."</w:t>
         <w:br/>
         <w:br/>
         <w:t>Voice: a youthful female voice — a woman in her mid-20s, bright and fairly high-pitched, light and breezy, casual relaxed pace.</w:t>
@@ -531,7 +552,7 @@
           <w:color w:val="333333"/>
           <w:sz w:val="19"/>
         </w:rPr>
-        <w:t>Very gentle, almost imperceptible slow push-in on the speaker, from a medium shot to a medium close-up over the whole clip. Single continuous take, no cuts or scene changes. She nods slowly with a knowing expression, then says: "No es falta de talento. Es que nadie te explicó cómo funciona el negocio detrás de la música. Por eso leí este libro."</w:t>
+        <w:t>Very gentle, almost imperceptible slow push-in on the speaker, from a medium shot to a medium close-up over the whole clip. Single continuous take, no cuts or scene changes. Anatomically correct body at all times: exactly two arms and two hands, five fingers per hand, no extra, duplicated, blurred, or merged limbs, no distorted or morphing anatomy. Do not add any props, objects, books, papers, phones, or items that are not explicitly described in this prompt — her hands stay empty and either still or performing only the exact gesture written below, nothing appears out of nowhere. Natural steady eye contact with the camera, normal human blink rate, no jittery, rapid, wandering, crossed, or distorted eye movement. Any gesture must be slow, subtle, and anatomically natural — no exaggerated, rapid, jerky, or repeated movement, no extra limbs appearing during the gesture. She nods slowly with a knowing expression, then says: "No es falta de talento. Es que nadie te explicó cómo funciona el negocio detrás de la música. Por eso leí este libro."</w:t>
         <w:br/>
         <w:br/>
         <w:t>Voice: a youthful female voice — a woman in her mid-20s, bright and fairly high-pitched, light and breezy, casual relaxed pace.</w:t>
@@ -566,7 +587,7 @@
           <w:color w:val="333333"/>
           <w:sz w:val="19"/>
         </w:rPr>
-        <w:t>(static camera, no movement) realistic arm movements and subtle micro-movements. Single continuous take, no cuts or scene changes. She points up toward the top of the frame as she says: "Music Business Para Todos Los Humanos. Búscalo en el link de la bio antes de tu próximo lanzamiento, no después."</w:t>
+        <w:t>(static camera, no movement) realistic arm movements and subtle micro-movements. Single continuous take, no cuts or scene changes. Anatomically correct body at all times: exactly two arms and two hands, five fingers per hand, no extra, duplicated, blurred, or merged limbs, no distorted or morphing anatomy. Do not add any props, objects, books, papers, phones, or items that are not explicitly described in this prompt — her hands stay empty and either still or performing only the exact gesture written below, nothing appears out of nowhere. Natural steady eye contact with the camera, normal human blink rate, no jittery, rapid, wandering, crossed, or distorted eye movement. Any gesture must be slow, subtle, and anatomically natural — no exaggerated, rapid, jerky, or repeated movement, no extra limbs appearing during the gesture. She points up toward the top of the frame as she says: "Music Business Para Todos Los Humanos. Búscalo en el link de la bio antes de tu próximo lanzamiento, no después."</w:t>
         <w:br/>
         <w:br/>
         <w:t>Voice: a youthful female voice — a woman in her mid-20s, bright and fairly high-pitched, light and breezy, casual relaxed pace.</w:t>
@@ -627,7 +648,7 @@
           <w:color w:val="333333"/>
           <w:sz w:val="19"/>
         </w:rPr>
-        <w:t>Slow subtle push-in, cinematic. Single continuous take, no cuts or scene changes. She tilts her head curiously, then says: "Si haces música, hay algo que probablemente no sabes sobre tus regalías, tus contratos o tu marca."</w:t>
+        <w:t>Slow subtle push-in, cinematic. Single continuous take, no cuts or scene changes. Anatomically correct body at all times: exactly two arms and two hands, five fingers per hand, no extra, duplicated, blurred, or merged limbs, no distorted or morphing anatomy. Do not add any props, objects, books, papers, phones, or items that are not explicitly described in this prompt — her hands stay empty and either still or performing only the exact gesture written below, nothing appears out of nowhere. Natural steady eye contact with the camera, normal human blink rate, no jittery, rapid, wandering, crossed, or distorted eye movement. Any gesture must be slow, subtle, and anatomically natural — no exaggerated, rapid, jerky, or repeated movement, no extra limbs appearing during the gesture. She tilts her head curiously, then says: "Si haces música, hay algo que probablemente no sabes sobre tus regalías, tus contratos o tu marca."</w:t>
         <w:br/>
         <w:br/>
         <w:t>Voice: a youthful female voice — a woman in her mid-20s, bright and fairly high-pitched, light and breezy, casual relaxed pace.</w:t>
@@ -662,7 +683,7 @@
           <w:color w:val="333333"/>
           <w:sz w:val="19"/>
         </w:rPr>
-        <w:t>(static camera, no movement) realistic arm movements and subtle micro-movements. Single continuous take, no cuts or scene changes. She smiles slightly, then says: "Yo tampoco lo sabía, hasta que leí un libro que me cambió completamente cómo veo esto."</w:t>
+        <w:t>(static camera, no movement) realistic arm movements and subtle micro-movements. Single continuous take, no cuts or scene changes. Anatomically correct body at all times: exactly two arms and two hands, five fingers per hand, no extra, duplicated, blurred, or merged limbs, no distorted or morphing anatomy. Do not add any props, objects, books, papers, phones, or items that are not explicitly described in this prompt — her hands stay empty and either still or performing only the exact gesture written below, nothing appears out of nowhere. Natural steady eye contact with the camera, normal human blink rate, no jittery, rapid, wandering, crossed, or distorted eye movement. Any gesture must be slow, subtle, and anatomically natural — no exaggerated, rapid, jerky, or repeated movement, no extra limbs appearing during the gesture. She smiles slightly, then says: "Yo tampoco lo sabía, hasta que leí un libro que me cambió completamente cómo veo esto."</w:t>
         <w:br/>
         <w:br/>
         <w:t>Voice: a youthful female voice — a woman in her mid-20s, bright and fairly high-pitched, light and breezy, casual relaxed pace.</w:t>
@@ -697,7 +718,7 @@
           <w:color w:val="333333"/>
           <w:sz w:val="19"/>
         </w:rPr>
-        <w:t>Slow, continuous zoom-in toward the subject's face, starting from the very first frame and moving steadily closer, then holding steady on the close-up for the rest of the clip. Single continuous take, no cuts or scene changes. She says: "Si quieres que te cuente qué aprendí, comenta LIBRO y te cuento."</w:t>
+        <w:t>Slow, continuous zoom-in toward the subject's face, starting from the very first frame and moving steadily closer, then holding steady on the close-up for the rest of the clip. Single continuous take, no cuts or scene changes. Anatomically correct body at all times: exactly two arms and two hands, five fingers per hand, no extra, duplicated, blurred, or merged limbs, no distorted or morphing anatomy. Do not add any props, objects, books, papers, phones, or items that are not explicitly described in this prompt — her hands stay empty and either still or performing only the exact gesture written below, nothing appears out of nowhere. Natural steady eye contact with the camera, normal human blink rate, no jittery, rapid, wandering, crossed, or distorted eye movement. Any gesture must be slow, subtle, and anatomically natural — no exaggerated, rapid, jerky, or repeated movement, no extra limbs appearing during the gesture. She says: "Si quieres que te cuente qué aprendí, comenta LIBRO y te cuento."</w:t>
         <w:br/>
         <w:br/>
         <w:t>Voice: a youthful female voice — a woman in her mid-20s, bright and fairly high-pitched, light and breezy, casual relaxed pace.</w:t>
@@ -758,7 +779,7 @@
           <w:color w:val="333333"/>
           <w:sz w:val="19"/>
         </w:rPr>
-        <w:t>(static camera, no movement) realistic arm movements and subtle micro-movements. Single continuous take, no cuts or scene changes. She says with direct, confident energy: "Leí este libro y es excelente. Se los recomiendo."</w:t>
+        <w:t>(static camera, no movement) realistic arm movements and subtle micro-movements. Single continuous take, no cuts or scene changes. Anatomically correct body at all times: exactly two arms and two hands, five fingers per hand, no extra, duplicated, blurred, or merged limbs, no distorted or morphing anatomy. Do not add any props, objects, books, papers, phones, or items that are not explicitly described in this prompt — her hands stay empty and either still or performing only the exact gesture written below, nothing appears out of nowhere. Natural steady eye contact with the camera, normal human blink rate, no jittery, rapid, wandering, crossed, or distorted eye movement. Any gesture must be slow, subtle, and anatomically natural — no exaggerated, rapid, jerky, or repeated movement, no extra limbs appearing during the gesture. She says with direct, confident energy: "Leí este libro y es excelente. Se los recomiendo."</w:t>
         <w:br/>
         <w:br/>
         <w:t>Voice: a youthful female voice — a woman in her mid-20s, bright and fairly high-pitched, light and breezy, casual relaxed pace.</w:t>
@@ -804,7 +825,7 @@
           <w:color w:val="333333"/>
           <w:sz w:val="19"/>
         </w:rPr>
-        <w:t>Very gentle, almost imperceptible slow push-in on the speaker, from a medium shot to a medium close-up over the whole clip. Single continuous take, no cuts or scene changes. She counts briefly on her fingers as she says: "Habla de derechos, contratos, cómo se reparte de verdad el dinero de Spotify, marca, hasta inteligencia artificial en la industria musical. Lo escribió IM Music, un sello discográfico independiente que está operando ahora mismo."</w:t>
+        <w:t>Very gentle, almost imperceptible slow push-in on the speaker, from a medium shot to a medium close-up over the whole clip. Single continuous take, no cuts or scene changes. Anatomically correct body at all times: exactly two arms and two hands, five fingers per hand, no extra, duplicated, blurred, or merged limbs, no distorted or morphing anatomy. Do not add any props, objects, books, papers, phones, or items that are not explicitly described in this prompt — her hands stay empty and either still or performing only the exact gesture written below, nothing appears out of nowhere. Natural steady eye contact with the camera, normal human blink rate, no jittery, rapid, wandering, crossed, or distorted eye movement. Any gesture must be slow, subtle, and anatomically natural — no exaggerated, rapid, jerky, or repeated movement, no extra limbs appearing during the gesture. She counts briefly on her fingers as she says: "Habla de derechos, contratos, cómo se reparte de verdad el dinero de Spotify, marca, hasta inteligencia artificial en la industria musical. Lo escribió IM Music, un sello discográfico independiente que está operando ahora mismo."</w:t>
         <w:br/>
         <w:br/>
         <w:t>Voice: a youthful female voice — a woman in her mid-20s, bright and fairly high-pitched, light and breezy, casual relaxed pace.</w:t>
@@ -839,7 +860,7 @@
           <w:color w:val="333333"/>
           <w:sz w:val="19"/>
         </w:rPr>
-        <w:t>(static camera, no movement) realistic arm movements and subtle micro-movements. Single continuous take, no cuts or scene changes. She holds up her hands slightly as she says: "Dieciséis con noventa dólares, noventa y dos páginas. Por lo que cuesta, no hay comparación con lo que te puede ahorrar. Consíganlo antes de su próximo lanzamiento — link en bio."</w:t>
+        <w:t>(static camera, no movement) realistic arm movements and subtle micro-movements. Single continuous take, no cuts or scene changes. Anatomically correct body at all times: exactly two arms and two hands, five fingers per hand, no extra, duplicated, blurred, or merged limbs, no distorted or morphing anatomy. Do not add any props, objects, books, papers, phones, or items that are not explicitly described in this prompt — her hands stay empty and either still or performing only the exact gesture written below, nothing appears out of nowhere. Natural steady eye contact with the camera, normal human blink rate, no jittery, rapid, wandering, crossed, or distorted eye movement. Any gesture must be slow, subtle, and anatomically natural — no exaggerated, rapid, jerky, or repeated movement, no extra limbs appearing during the gesture. She holds up her hands slightly as she says: "Dieciséis con noventa dólares, noventa y dos páginas. Por lo que cuesta, no hay comparación con lo que te puede ahorrar. Consíganlo antes de su próximo lanzamiento — link en bio."</w:t>
         <w:br/>
         <w:br/>
         <w:t>Voice: a youthful female voice — a woman in her mid-20s, bright and fairly high-pitched, light and breezy, casual relaxed pace.</w:t>
@@ -1148,7 +1169,7 @@
         <w:t>[CÁMARA — pega aquí el movimiento de cámara de esta toma]</w:t>
         <w:br/>
         <w:br/>
-        <w:t>Single continuous take, no cuts or scene changes.</w:t>
+        <w:t>Single continuous take, no cuts or scene changes. Anatomically correct body at all times: exactly two arms and two hands, five fingers per hand, no extra, duplicated, blurred, or merged limbs, no distorted or morphing anatomy. Do not add any props, objects, books, papers, phones, or items that are not explicitly described in this prompt — her hands stay empty and either still or performing only the exact gesture written below, nothing appears out of nowhere. Natural steady eye contact with the camera, normal human blink rate, no jittery, rapid, wandering, crossed, or distorted eye movement. Any gesture must be slow, subtle, and anatomically natural — no exaggerated, rapid, jerky, or repeated movement, no extra limbs appearing during the gesture.</w:t>
         <w:br/>
         <w:br/>
         <w:t>[ACCIÓN opcional — un gesto], she says: "[GUIÓN — pega aquí la línea exacta de esta toma]"</w:t>

</xml_diff>

<commit_message>
docs: detalle extremo especifico por cada uno de los 10 clips (manos, libro, ojos)
Co-Authored-By: Claude Sonnet 5 <noreply@anthropic.com>
Claude-Session: https://claude.ai/code/session_01BGajP5s9F1aLgfyztSAp9Y
</commit_message>
<xml_diff>
--- a/docs/libro/Prompts_Creadora_IA_Video_Libro_IM_Music.docx
+++ b/docs/libro/Prompts_Creadora_IA_Video_Libro_IM_Music.docx
@@ -482,7 +482,7 @@
           <w:color w:val="333333"/>
           <w:sz w:val="19"/>
         </w:rPr>
-        <w:t>Slow, continuous zoom-in toward the subject's face, starting from the very first frame and moving steadily closer, then holding steady on the close-up for the rest of the clip. Single continuous take, no cuts or scene changes. Anatomically correct body at all times: exactly two arms and two hands, five fingers per hand, no extra, duplicated, blurred, or merged limbs, no distorted or morphing anatomy. Do not add any props, objects, books, papers, phones, or items that are not explicitly described in this prompt — her hands stay empty and either still or performing only the exact gesture written below, nothing appears out of nowhere. Natural steady eye contact with the camera, normal human blink rate, no jittery, rapid, wandering, crossed, or distorted eye movement. Any gesture must be slow, subtle, and anatomically natural — no exaggerated, rapid, jerky, or repeated movement, no extra limbs appearing during the gesture. She looks directly at the camera with a serious, confessional expression and says: "¿Sabes cuánto dinero de tu música se está quedando en el camino ahora mismo, sin que te enteres?"</w:t>
+        <w:t>Slow, continuous zoom-in toward the subject's face, starting from the very first frame and moving steadily closer, then holding steady on the close-up for the rest of the clip. Single continuous take, no cuts or scene changes. Anatomically correct body at all times: exactly two arms and two hands, five fingers per hand, no extra, duplicated, blurred, or merged limbs, no distorted or morphing anatomy. Do not add any props, objects, books, papers, phones, or items that are not explicitly described in this prompt — her hands stay empty and either still or performing only the exact gesture written below, nothing appears out of nowhere. Natural steady eye contact with the camera, normal human blink rate, no jittery, rapid, wandering, crossed, or distorted eye movement. Any gesture must be slow, subtle, and anatomically natural — no exaggerated, rapid, jerky, or repeated movement, no extra limbs appearing during the gesture. In this clip she makes NO hand gestures at all — both hands and arms stay completely still, resting naturally out of frame or gently at her sides for the entire 10 seconds, never rising into view. Only her face moves: a serious, confessional expression, calm steady gaze locked on the camera, minimal natural head movement. She looks directly at the camera with a serious, confessional expression and says: "¿Sabes cuánto dinero de tu música se está quedando en el camino ahora mismo, sin que te enteres?"</w:t>
         <w:br/>
         <w:br/>
         <w:t>Voice: a youthful female voice — a woman in her mid-20s, bright and fairly high-pitched, light and breezy, casual relaxed pace.</w:t>
@@ -517,7 +517,7 @@
           <w:color w:val="333333"/>
           <w:sz w:val="19"/>
         </w:rPr>
-        <w:t>(static camera, no movement) realistic arm movements and subtle micro-movements. Single continuous take, no cuts or scene changes. Anatomically correct body at all times: exactly two arms and two hands, five fingers per hand, no extra, duplicated, blurred, or merged limbs, no distorted or morphing anatomy. Do not add any props, objects, books, papers, phones, or items that are not explicitly described in this prompt — her hands stay empty and either still or performing only the exact gesture written below, nothing appears out of nowhere. Natural steady eye contact with the camera, normal human blink rate, no jittery, rapid, wandering, crossed, or distorted eye movement. Any gesture must be slow, subtle, and anatomically natural — no exaggerated, rapid, jerky, or repeated movement, no extra limbs appearing during the gesture. She raises one hand slightly as she explains, then says: "Cada vez que suena tu canción, hay un pago que te corresponde. Y la mayoría de artistas independientes nunca lo cobra."</w:t>
+        <w:t>(static camera, no movement) realistic arm movements and subtle micro-movements. Single continuous take, no cuts or scene changes. Anatomically correct body at all times: exactly two arms and two hands, five fingers per hand, no extra, duplicated, blurred, or merged limbs, no distorted or morphing anatomy. Do not add any props, objects, books, papers, phones, or items that are not explicitly described in this prompt — her hands stay empty and either still or performing only the exact gesture written below, nothing appears out of nowhere. Natural steady eye contact with the camera, normal human blink rate, no jittery, rapid, wandering, crossed, or distorted eye movement. Any gesture must be slow, subtle, and anatomically natural — no exaggerated, rapid, jerky, or repeated movement, no extra limbs appearing during the gesture. Only her RIGHT hand rises slowly from waist height to about chest height, palm loosely open, in one single smooth motion as she starts explaining, then it lowers back down and stays still for the rest of the clip — one continuous rise-and-settle, never repeating or flapping up and down. Her LEFT arm and hand stay completely still at her side the entire time, always out of frame or visibly resting, never rising, never duplicating the other hand's motion. At every single frame there are exactly two hands, five fingers each, no blurred or merged fingers. She raises one hand slightly as she explains, then says: "Cada vez que suena tu canción, hay un pago que te corresponde. Y la mayoría de artistas independientes nunca lo cobra."</w:t>
         <w:br/>
         <w:br/>
         <w:t>Voice: a youthful female voice — a woman in her mid-20s, bright and fairly high-pitched, light and breezy, casual relaxed pace.</w:t>
@@ -552,7 +552,7 @@
           <w:color w:val="333333"/>
           <w:sz w:val="19"/>
         </w:rPr>
-        <w:t>Very gentle, almost imperceptible slow push-in on the speaker, from a medium shot to a medium close-up over the whole clip. Single continuous take, no cuts or scene changes. Anatomically correct body at all times: exactly two arms and two hands, five fingers per hand, no extra, duplicated, blurred, or merged limbs, no distorted or morphing anatomy. Do not add any props, objects, books, papers, phones, or items that are not explicitly described in this prompt — her hands stay empty and either still or performing only the exact gesture written below, nothing appears out of nowhere. Natural steady eye contact with the camera, normal human blink rate, no jittery, rapid, wandering, crossed, or distorted eye movement. Any gesture must be slow, subtle, and anatomically natural — no exaggerated, rapid, jerky, or repeated movement, no extra limbs appearing during the gesture. She nods slowly with a knowing expression, then says: "No es falta de talento. Es que nadie te explicó cómo funciona el negocio detrás de la música. Por eso leí este libro."</w:t>
+        <w:t>Very gentle, almost imperceptible slow push-in on the speaker, from a medium shot to a medium close-up over the whole clip. Single continuous take, no cuts or scene changes. Anatomically correct body at all times: exactly two arms and two hands, five fingers per hand, no extra, duplicated, blurred, or merged limbs, no distorted or morphing anatomy. Do not add any props, objects, books, papers, phones, or items that are not explicitly described in this prompt — her hands stay empty and either still or performing only the exact gesture written below, nothing appears out of nowhere. Natural steady eye contact with the camera, normal human blink rate, no jittery, rapid, wandering, crossed, or distorted eye movement. Any gesture must be slow, subtle, and anatomically natural — no exaggerated, rapid, jerky, or repeated movement, no extra limbs appearing during the gesture. Both hands and arms stay completely still and out of frame or resting naturally for the entire clip — no hand ever becomes visible or gestures. Only her head moves, in one slow, single, natural nod, no repeated bobbing. Even though she says the word "libro" out loud, absolutely no physical book, object, or prop of any kind appears anywhere in the frame at any point — it is only spoken, nothing materializes in her hands or around her. She nods slowly with a knowing expression, then says: "No es falta de talento. Es que nadie te explicó cómo funciona el negocio detrás de la música. Por eso leí este libro."</w:t>
         <w:br/>
         <w:br/>
         <w:t>Voice: a youthful female voice — a woman in her mid-20s, bright and fairly high-pitched, light and breezy, casual relaxed pace.</w:t>
@@ -587,7 +587,7 @@
           <w:color w:val="333333"/>
           <w:sz w:val="19"/>
         </w:rPr>
-        <w:t>(static camera, no movement) realistic arm movements and subtle micro-movements. Single continuous take, no cuts or scene changes. Anatomically correct body at all times: exactly two arms and two hands, five fingers per hand, no extra, duplicated, blurred, or merged limbs, no distorted or morphing anatomy. Do not add any props, objects, books, papers, phones, or items that are not explicitly described in this prompt — her hands stay empty and either still or performing only the exact gesture written below, nothing appears out of nowhere. Natural steady eye contact with the camera, normal human blink rate, no jittery, rapid, wandering, crossed, or distorted eye movement. Any gesture must be slow, subtle, and anatomically natural — no exaggerated, rapid, jerky, or repeated movement, no extra limbs appearing during the gesture. She points up toward the top of the frame as she says: "Music Business Para Todos Los Humanos. Búscalo en el link de la bio antes de tu próximo lanzamiento, no después."</w:t>
+        <w:t>(static camera, no movement) realistic arm movements and subtle micro-movements. Single continuous take, no cuts or scene changes. Anatomically correct body at all times: exactly two arms and two hands, five fingers per hand, no extra, duplicated, blurred, or merged limbs, no distorted or morphing anatomy. Do not add any props, objects, books, papers, phones, or items that are not explicitly described in this prompt — her hands stay empty and either still or performing only the exact gesture written below, nothing appears out of nowhere. Natural steady eye contact with the camera, normal human blink rate, no jittery, rapid, wandering, crossed, or distorted eye movement. Any gesture must be slow, subtle, and anatomically natural — no exaggerated, rapid, jerky, or repeated movement, no extra limbs appearing during the gesture. Only her RIGHT hand rises once, index finger extended, pointing up toward the top of the frame in one single smooth motion, then holds briefly and lowers — no repeated or jittery pointing. Her LEFT arm and hand stay completely still at her side the whole time, out of frame or resting, never appearing to move or duplicate. Exactly two hands visible at all times, five fingers each, no extra or blurred fingers on the pointing hand. No book, phone, or any object appears in her hand or in frame despite the book title being said aloud. She points up toward the top of the frame as she says: "Music Business Para Todos Los Humanos. Búscalo en el link de la bio antes de tu próximo lanzamiento, no después."</w:t>
         <w:br/>
         <w:br/>
         <w:t>Voice: a youthful female voice — a woman in her mid-20s, bright and fairly high-pitched, light and breezy, casual relaxed pace.</w:t>
@@ -648,7 +648,7 @@
           <w:color w:val="333333"/>
           <w:sz w:val="19"/>
         </w:rPr>
-        <w:t>Slow subtle push-in, cinematic. Single continuous take, no cuts or scene changes. Anatomically correct body at all times: exactly two arms and two hands, five fingers per hand, no extra, duplicated, blurred, or merged limbs, no distorted or morphing anatomy. Do not add any props, objects, books, papers, phones, or items that are not explicitly described in this prompt — her hands stay empty and either still or performing only the exact gesture written below, nothing appears out of nowhere. Natural steady eye contact with the camera, normal human blink rate, no jittery, rapid, wandering, crossed, or distorted eye movement. Any gesture must be slow, subtle, and anatomically natural — no exaggerated, rapid, jerky, or repeated movement, no extra limbs appearing during the gesture. She tilts her head curiously, then says: "Si haces música, hay algo que probablemente no sabes sobre tus regalías, tus contratos o tu marca."</w:t>
+        <w:t>Slow subtle push-in, cinematic. Single continuous take, no cuts or scene changes. Anatomically correct body at all times: exactly two arms and two hands, five fingers per hand, no extra, duplicated, blurred, or merged limbs, no distorted or morphing anatomy. Do not add any props, objects, books, papers, phones, or items that are not explicitly described in this prompt — her hands stay empty and either still or performing only the exact gesture written below, nothing appears out of nowhere. Natural steady eye contact with the camera, normal human blink rate, no jittery, rapid, wandering, crossed, or distorted eye movement. Any gesture must be slow, subtle, and anatomically natural — no exaggerated, rapid, jerky, or repeated movement, no extra limbs appearing during the gesture. Both hands and arms stay completely still and out of frame or resting naturally for the entire clip — no hand gesture at all. Only her head tilts once, slowly and slightly, in a single natural motion, no repeated tilting. She tilts her head curiously, then says: "Si haces música, hay algo que probablemente no sabes sobre tus regalías, tus contratos o tu marca."</w:t>
         <w:br/>
         <w:br/>
         <w:t>Voice: a youthful female voice — a woman in her mid-20s, bright and fairly high-pitched, light and breezy, casual relaxed pace.</w:t>
@@ -683,7 +683,7 @@
           <w:color w:val="333333"/>
           <w:sz w:val="19"/>
         </w:rPr>
-        <w:t>(static camera, no movement) realistic arm movements and subtle micro-movements. Single continuous take, no cuts or scene changes. Anatomically correct body at all times: exactly two arms and two hands, five fingers per hand, no extra, duplicated, blurred, or merged limbs, no distorted or morphing anatomy. Do not add any props, objects, books, papers, phones, or items that are not explicitly described in this prompt — her hands stay empty and either still or performing only the exact gesture written below, nothing appears out of nowhere. Natural steady eye contact with the camera, normal human blink rate, no jittery, rapid, wandering, crossed, or distorted eye movement. Any gesture must be slow, subtle, and anatomically natural — no exaggerated, rapid, jerky, or repeated movement, no extra limbs appearing during the gesture. She smiles slightly, then says: "Yo tampoco lo sabía, hasta que leí un libro que me cambió completamente cómo veo esto."</w:t>
+        <w:t>(static camera, no movement) realistic arm movements and subtle micro-movements. Single continuous take, no cuts or scene changes. Anatomically correct body at all times: exactly two arms and two hands, five fingers per hand, no extra, duplicated, blurred, or merged limbs, no distorted or morphing anatomy. Do not add any props, objects, books, papers, phones, or items that are not explicitly described in this prompt — her hands stay empty and either still or performing only the exact gesture written below, nothing appears out of nowhere. Natural steady eye contact with the camera, normal human blink rate, no jittery, rapid, wandering, crossed, or distorted eye movement. Any gesture must be slow, subtle, and anatomically natural — no exaggerated, rapid, jerky, or repeated movement, no extra limbs appearing during the gesture. Both hands and arms stay completely still and out of frame or resting naturally for the entire clip — no hand gesture at all. Only her expression changes into a slight, natural smile. Even though she says the word "libro" out loud, absolutely no physical book, object, or prop of any kind appears anywhere in the frame at any point — it is only spoken, nothing materializes in her hands or around her. She smiles slightly, then says: "Yo tampoco lo sabía, hasta que leí un libro que me cambió completamente cómo veo esto."</w:t>
         <w:br/>
         <w:br/>
         <w:t>Voice: a youthful female voice — a woman in her mid-20s, bright and fairly high-pitched, light and breezy, casual relaxed pace.</w:t>
@@ -718,7 +718,7 @@
           <w:color w:val="333333"/>
           <w:sz w:val="19"/>
         </w:rPr>
-        <w:t>Slow, continuous zoom-in toward the subject's face, starting from the very first frame and moving steadily closer, then holding steady on the close-up for the rest of the clip. Single continuous take, no cuts or scene changes. Anatomically correct body at all times: exactly two arms and two hands, five fingers per hand, no extra, duplicated, blurred, or merged limbs, no distorted or morphing anatomy. Do not add any props, objects, books, papers, phones, or items that are not explicitly described in this prompt — her hands stay empty and either still or performing only the exact gesture written below, nothing appears out of nowhere. Natural steady eye contact with the camera, normal human blink rate, no jittery, rapid, wandering, crossed, or distorted eye movement. Any gesture must be slow, subtle, and anatomically natural — no exaggerated, rapid, jerky, or repeated movement, no extra limbs appearing during the gesture. She says: "Si quieres que te cuente qué aprendí, comenta LIBRO y te cuento."</w:t>
+        <w:t>Slow, continuous zoom-in toward the subject's face, starting from the very first frame and moving steadily closer, then holding steady on the close-up for the rest of the clip. Single continuous take, no cuts or scene changes. Anatomically correct body at all times: exactly two arms and two hands, five fingers per hand, no extra, duplicated, blurred, or merged limbs, no distorted or morphing anatomy. Do not add any props, objects, books, papers, phones, or items that are not explicitly described in this prompt — her hands stay empty and either still or performing only the exact gesture written below, nothing appears out of nowhere. Natural steady eye contact with the camera, normal human blink rate, no jittery, rapid, wandering, crossed, or distorted eye movement. Any gesture must be slow, subtle, and anatomically natural — no exaggerated, rapid, jerky, or repeated movement, no extra limbs appearing during the gesture. Both hands and arms stay completely still and out of frame or resting naturally for the entire clip — no hand gesture at all. Even though the word "LIBRO" is said out loud as a comment keyword, absolutely no physical book, object, or prop of any kind appears anywhere in the frame at any point — it is only spoken, nothing materializes in her hands or around her. She says: "Si quieres que te cuente qué aprendí, comenta LIBRO y te cuento."</w:t>
         <w:br/>
         <w:br/>
         <w:t>Voice: a youthful female voice — a woman in her mid-20s, bright and fairly high-pitched, light and breezy, casual relaxed pace.</w:t>
@@ -779,7 +779,7 @@
           <w:color w:val="333333"/>
           <w:sz w:val="19"/>
         </w:rPr>
-        <w:t>(static camera, no movement) realistic arm movements and subtle micro-movements. Single continuous take, no cuts or scene changes. Anatomically correct body at all times: exactly two arms and two hands, five fingers per hand, no extra, duplicated, blurred, or merged limbs, no distorted or morphing anatomy. Do not add any props, objects, books, papers, phones, or items that are not explicitly described in this prompt — her hands stay empty and either still or performing only the exact gesture written below, nothing appears out of nowhere. Natural steady eye contact with the camera, normal human blink rate, no jittery, rapid, wandering, crossed, or distorted eye movement. Any gesture must be slow, subtle, and anatomically natural — no exaggerated, rapid, jerky, or repeated movement, no extra limbs appearing during the gesture. She says with direct, confident energy: "Leí este libro y es excelente. Se los recomiendo."</w:t>
+        <w:t>(static camera, no movement) realistic arm movements and subtle micro-movements. Single continuous take, no cuts or scene changes. Anatomically correct body at all times: exactly two arms and two hands, five fingers per hand, no extra, duplicated, blurred, or merged limbs, no distorted or morphing anatomy. Do not add any props, objects, books, papers, phones, or items that are not explicitly described in this prompt — her hands stay empty and either still or performing only the exact gesture written below, nothing appears out of nowhere. Natural steady eye contact with the camera, normal human blink rate, no jittery, rapid, wandering, crossed, or distorted eye movement. Any gesture must be slow, subtle, and anatomically natural — no exaggerated, rapid, jerky, or repeated movement, no extra limbs appearing during the gesture. Both hands and arms stay completely still and out of frame or resting naturally for the entire clip — no hand gesture at all. Only her expression carries direct, confident energy. Even though she says the word "libro" out loud, absolutely no physical book, object, or prop of any kind appears anywhere in the frame at any point — it is only spoken, nothing materializes in her hands or around her. She says with direct, confident energy: "Leí este libro y es excelente. Se los recomiendo."</w:t>
         <w:br/>
         <w:br/>
         <w:t>Voice: a youthful female voice — a woman in her mid-20s, bright and fairly high-pitched, light and breezy, casual relaxed pace.</w:t>
@@ -825,7 +825,7 @@
           <w:color w:val="333333"/>
           <w:sz w:val="19"/>
         </w:rPr>
-        <w:t>Very gentle, almost imperceptible slow push-in on the speaker, from a medium shot to a medium close-up over the whole clip. Single continuous take, no cuts or scene changes. Anatomically correct body at all times: exactly two arms and two hands, five fingers per hand, no extra, duplicated, blurred, or merged limbs, no distorted or morphing anatomy. Do not add any props, objects, books, papers, phones, or items that are not explicitly described in this prompt — her hands stay empty and either still or performing only the exact gesture written below, nothing appears out of nowhere. Natural steady eye contact with the camera, normal human blink rate, no jittery, rapid, wandering, crossed, or distorted eye movement. Any gesture must be slow, subtle, and anatomically natural — no exaggerated, rapid, jerky, or repeated movement, no extra limbs appearing during the gesture. She counts briefly on her fingers as she says: "Habla de derechos, contratos, cómo se reparte de verdad el dinero de Spotify, marca, hasta inteligencia artificial en la industria musical. Lo escribió IM Music, un sello discográfico independiente que está operando ahora mismo."</w:t>
+        <w:t>Very gentle, almost imperceptible slow push-in on the speaker, from a medium shot to a medium close-up over the whole clip. Single continuous take, no cuts or scene changes. Anatomically correct body at all times: exactly two arms and two hands, five fingers per hand, no extra, duplicated, blurred, or merged limbs, no distorted or morphing anatomy. Do not add any props, objects, books, papers, phones, or items that are not explicitly described in this prompt — her hands stay empty and either still or performing only the exact gesture written below, nothing appears out of nowhere. Natural steady eye contact with the camera, normal human blink rate, no jittery, rapid, wandering, crossed, or distorted eye movement. Any gesture must be slow, subtle, and anatomically natural — no exaggerated, rapid, jerky, or repeated movement, no extra limbs appearing during the gesture. Only her RIGHT hand rises to about chest height and counts naturally, folding down one finger at a time (starting from an open palm) in slow, deliberate, natural counting motions — at most 3 fingers folded across the whole clip, always exactly five fingers visible on that hand, no extra or merged fingers, no repeated or jittery counting. Her LEFT arm and hand stay completely still at her side the entire time, out of frame or resting, never rising or duplicating. No book or any physical object appears in frame despite referring to who wrote it. She counts briefly on her fingers as she says: "Habla de derechos, contratos, cómo se reparte de verdad el dinero de Spotify, marca, hasta inteligencia artificial en la industria musical. Lo escribió IM Music, un sello discográfico independiente que está operando ahora mismo."</w:t>
         <w:br/>
         <w:br/>
         <w:t>Voice: a youthful female voice — a woman in her mid-20s, bright and fairly high-pitched, light and breezy, casual relaxed pace.</w:t>
@@ -860,7 +860,7 @@
           <w:color w:val="333333"/>
           <w:sz w:val="19"/>
         </w:rPr>
-        <w:t>(static camera, no movement) realistic arm movements and subtle micro-movements. Single continuous take, no cuts or scene changes. Anatomically correct body at all times: exactly two arms and two hands, five fingers per hand, no extra, duplicated, blurred, or merged limbs, no distorted or morphing anatomy. Do not add any props, objects, books, papers, phones, or items that are not explicitly described in this prompt — her hands stay empty and either still or performing only the exact gesture written below, nothing appears out of nowhere. Natural steady eye contact with the camera, normal human blink rate, no jittery, rapid, wandering, crossed, or distorted eye movement. Any gesture must be slow, subtle, and anatomically natural — no exaggerated, rapid, jerky, or repeated movement, no extra limbs appearing during the gesture. She holds up her hands slightly as she says: "Dieciséis con noventa dólares, noventa y dos páginas. Por lo que cuesta, no hay comparación con lo que te puede ahorrar. Consíganlo antes de su próximo lanzamiento — link en bio."</w:t>
+        <w:t>(static camera, no movement) realistic arm movements and subtle micro-movements. Single continuous take, no cuts or scene changes. Anatomically correct body at all times: exactly two arms and two hands, five fingers per hand, no extra, duplicated, blurred, or merged limbs, no distorted or morphing anatomy. Do not add any props, objects, books, papers, phones, or items that are not explicitly described in this prompt — her hands stay empty and either still or performing only the exact gesture written below, nothing appears out of nowhere. Natural steady eye contact with the camera, normal human blink rate, no jittery, rapid, wandering, crossed, or distorted eye movement. Any gesture must be slow, subtle, and anatomically natural — no exaggerated, rapid, jerky, or repeated movement, no extra limbs appearing during the gesture. Both hands rise together, gently and only once, from waist height to about chest height, palms open and relaxed facing the camera, fingers naturally spread (five per hand, ten total, no extra or merged fingers), hold briefly for a couple of seconds, then lower back down — a single smooth rise-hold-lower motion, no repeating, no flapping. No money, bills, phone, book, or any other object appears in her hands or in frame despite mentioning the price — her hands stay empty the whole time. She holds up her hands slightly as she says: "Dieciséis con noventa dólares, noventa y dos páginas. Por lo que cuesta, no hay comparación con lo que te puede ahorrar. Consíganlo antes de su próximo lanzamiento — link en bio."</w:t>
         <w:br/>
         <w:br/>
         <w:t>Voice: a youthful female voice — a woman in her mid-20s, bright and fairly high-pitched, light and breezy, casual relaxed pace.</w:t>
@@ -1149,51 +1149,28 @@
           <w:color w:val="666666"/>
           <w:sz w:val="20"/>
         </w:rPr>
-        <w:t>Una sola plantilla. La usas 10 veces, cambiando solo `[CÁMARA]` y `[ACCIÓN+GUIÓN]` por lo de la tabla de abajo. Todo lo demás (identidad, voz, acento) se queda igual siempre.</w:t>
+        <w:t>Aviso importante: esta plantilla genérica quedó descontinuada. Cada una de las 10 tomas tiene un problema distinto de anatomía/objetos (en cuál mano se mueve, si aparece un libro de la nada, etc.), y meterlo todo en una sola plantilla con placeholders perdía esa precisión — por eso salían las manos de más, los ojos raros y el libro apareciendo solo. La versión que sí debes usar para copiar y pegar es la de las secciones 4, 5 y 6: ahí cada uno de los 10 clips ya viene completo, listo para pegar, con instrucciones específicas de esa toma (qué mano se mueve, cuántos dedos, que NO aparezca ningún libro/objeto aunque se mencione la palabra "libro", parpadeo normal, etc.).</w:t>
       </w:r>
     </w:p>
     <w:p>
       <w:pPr>
-        <w:ind w:left="432"/>
-        <w:shd w:val="clear" w:fill="F2EDE5"/>
+        <w:spacing w:after="160"/>
       </w:pPr>
       <w:r>
         <w:rPr>
-          <w:rFonts w:ascii="Consolas" w:hAnsi="Consolas"/>
-          <w:color w:val="333333"/>
-          <w:sz w:val="19"/>
+          <w:rFonts w:ascii="Georgia" w:hAnsi="Georgia"/>
+          <w:b/>
+          <w:color w:val="5E17EB"/>
+          <w:sz w:val="22"/>
         </w:rPr>
-        <w:t>Using the reference image, keep the SAME person — same face and identity, same outfit, same background and lighting.</w:t>
-        <w:br/>
-        <w:br/>
-        <w:t>[CÁMARA — pega aquí el movimiento de cámara de esta toma]</w:t>
-        <w:br/>
-        <w:br/>
-        <w:t>Single continuous take, no cuts or scene changes. Anatomically correct body at all times: exactly two arms and two hands, five fingers per hand, no extra, duplicated, blurred, or merged limbs, no distorted or morphing anatomy. Do not add any props, objects, books, papers, phones, or items that are not explicitly described in this prompt — her hands stay empty and either still or performing only the exact gesture written below, nothing appears out of nowhere. Natural steady eye contact with the camera, normal human blink rate, no jittery, rapid, wandering, crossed, or distorted eye movement. Any gesture must be slow, subtle, and anatomically natural — no exaggerated, rapid, jerky, or repeated movement, no extra limbs appearing during the gesture.</w:t>
-        <w:br/>
-        <w:br/>
-        <w:t>[ACCIÓN opcional — un gesto], she says: "[GUIÓN — pega aquí la línea exacta de esta toma]"</w:t>
-        <w:br/>
-        <w:br/>
-        <w:t>Voice: a youthful female voice — a woman in her mid-20s, bright and fairly high-pitched, light and breezy, casual relaxed pace.</w:t>
-        <w:br/>
-        <w:br/>
-        <w:t>Spanish with a clear, neutral Colombian (Bogotá) accent.</w:t>
+        <w:t>Resumen rápido de las 10 tomas</w:t>
       </w:r>
-    </w:p>
-    <w:p/>
-    <w:p>
-      <w:pPr>
-        <w:spacing w:before="240" w:after="120"/>
-      </w:pPr>
       <w:r>
         <w:rPr>
-          <w:rFonts w:ascii="Bahnschrift" w:hAnsi="Bahnschrift"/>
-          <w:b/>
-          <w:color w:val="000000"/>
-          <w:sz w:val="26"/>
+          <w:rFonts w:ascii="Georgia" w:hAnsi="Georgia"/>
+          <w:sz w:val="22"/>
         </w:rPr>
-        <w:t>Los 10 valores a insertar</w:t>
+        <w:t xml:space="preserve"> (para ubicarte — el prompt completo y correcto de cada una está en su sección):</w:t>
       </w:r>
     </w:p>
     <w:p>
@@ -1209,17 +1186,12 @@
         </w:rPr>
         <w:t>VIDEO 1 — FRÍA</w:t>
       </w:r>
-    </w:p>
-    <w:p>
-      <w:pPr>
-        <w:pStyle w:val="ListNumber"/>
-      </w:pPr>
       <w:r>
         <w:rPr>
           <w:rFonts w:ascii="Georgia" w:hAnsi="Georgia"/>
           <w:sz w:val="22"/>
         </w:rPr>
-        <w:t>`[CÁMARA]`: Slow, continuous zoom-in toward the subject's face, holding on the close-up. → `[ACCIÓN+GUIÓN]`: with a serious expression, "¿Sabes cuánto dinero de tu música se está quedando en el camino ahora mismo, sin que te enteres?"</w:t>
+        <w:t xml:space="preserve"> (sección 4)</w:t>
       </w:r>
     </w:p>
     <w:p>
@@ -1231,7 +1203,7 @@
           <w:rFonts w:ascii="Georgia" w:hAnsi="Georgia"/>
           <w:sz w:val="22"/>
         </w:rPr>
-        <w:t>`[CÁMARA]`: (static camera, no movement) realistic arm movements. → raising one hand slightly, "Cada vez que suena tu canción, hay un pago que te corresponde. Y la mayoría de artistas independientes nunca lo cobra."</w:t>
+        <w:t>Hook — sin gestos, solo expresión seria → sección 4, Clip 1</w:t>
       </w:r>
     </w:p>
     <w:p>
@@ -1243,7 +1215,7 @@
           <w:rFonts w:ascii="Georgia" w:hAnsi="Georgia"/>
           <w:sz w:val="22"/>
         </w:rPr>
-        <w:t>`[CÁMARA]`: Very gentle slow push-in, medium to medium close-up. → nodding slowly, "No es falta de talento. Es que nadie te explicó cómo funciona el negocio detrás de la música. Por eso leí este libro."</w:t>
+        <w:t>Agitación — sube solo la mano derecha una vez → sección 4, Clip 2</w:t>
       </w:r>
     </w:p>
     <w:p>
@@ -1255,7 +1227,19 @@
           <w:rFonts w:ascii="Georgia" w:hAnsi="Georgia"/>
           <w:sz w:val="22"/>
         </w:rPr>
-        <w:t>`[CÁMARA]`: (static camera, no movement) realistic arm movements. → pointing up, "Music Business Para Todos Los Humanos. Búscalo en el link de la bio antes de tu próximo lanzamiento, no después."</w:t>
+        <w:t>Revelación — solo asiente con la cabeza, menciona "libro" sin que aparezca ninguno → sección 4, Clip 3</w:t>
+      </w:r>
+    </w:p>
+    <w:p>
+      <w:pPr>
+        <w:pStyle w:val="ListNumber"/>
+      </w:pPr>
+      <w:r>
+        <w:rPr>
+          <w:rFonts w:ascii="Georgia" w:hAnsi="Georgia"/>
+          <w:sz w:val="22"/>
+        </w:rPr>
+        <w:t>CTA — apunta hacia arriba con la mano derecha → sección 4, Clip 4</w:t>
       </w:r>
     </w:p>
     <w:p>
@@ -1271,17 +1255,12 @@
         </w:rPr>
         <w:t>VIDEO 2 — TIBIA</w:t>
       </w:r>
-    </w:p>
-    <w:p>
-      <w:pPr>
-        <w:pStyle w:val="ListNumber"/>
-      </w:pPr>
       <w:r>
         <w:rPr>
           <w:rFonts w:ascii="Georgia" w:hAnsi="Georgia"/>
           <w:sz w:val="22"/>
         </w:rPr>
-        <w:t>`[CÁMARA]`: Slow subtle push-in, cinematic. → tilting her head curiously, "Si haces música, hay algo que probablemente no sabes sobre tus regalías, tus contratos o tu marca."</w:t>
+        <w:t xml:space="preserve"> (sección 5)</w:t>
       </w:r>
     </w:p>
     <w:p>
@@ -1293,7 +1272,7 @@
           <w:rFonts w:ascii="Georgia" w:hAnsi="Georgia"/>
           <w:sz w:val="22"/>
         </w:rPr>
-        <w:t>`[CÁMARA]`: (static camera, no movement) realistic arm movements. → smiling slightly, "Yo tampoco lo sabía, hasta que leí un libro que me cambió completamente cómo veo esto."</w:t>
+        <w:t>Curiosidad — sin gestos, solo inclina la cabeza → sección 5, Clip 1</w:t>
       </w:r>
     </w:p>
     <w:p>
@@ -1305,7 +1284,19 @@
           <w:rFonts w:ascii="Georgia" w:hAnsi="Georgia"/>
           <w:sz w:val="22"/>
         </w:rPr>
-        <w:t>`[CÁMARA]`: Slow, continuous zoom-in, holding on close-up. → "Si quieres que te cuente qué aprendí, comenta LIBRO y te cuento."</w:t>
+        <w:t>Puente personal — sin gestos, solo sonríe, menciona "libro" sin que aparezca ninguno → sección 5, Clip 2</w:t>
+      </w:r>
+    </w:p>
+    <w:p>
+      <w:pPr>
+        <w:pStyle w:val="ListNumber"/>
+      </w:pPr>
+      <w:r>
+        <w:rPr>
+          <w:rFonts w:ascii="Georgia" w:hAnsi="Georgia"/>
+          <w:sz w:val="22"/>
+        </w:rPr>
+        <w:t>CTA de comentario — sin gestos, menciona "LIBRO" sin que aparezca ninguno → sección 5, Clip 3</w:t>
       </w:r>
     </w:p>
     <w:p>
@@ -1321,17 +1312,12 @@
         </w:rPr>
         <w:t>VIDEO 3 — CALIENTE</w:t>
       </w:r>
-    </w:p>
-    <w:p>
-      <w:pPr>
-        <w:pStyle w:val="ListNumber"/>
-      </w:pPr>
       <w:r>
         <w:rPr>
           <w:rFonts w:ascii="Georgia" w:hAnsi="Georgia"/>
           <w:sz w:val="22"/>
         </w:rPr>
-        <w:t>`[CÁMARA]`: (static camera, no movement) realistic arm movements. → with direct, confident energy, "Leí este libro y es excelente. Se los recomiendo."</w:t>
+        <w:t xml:space="preserve"> (sección 6)</w:t>
       </w:r>
     </w:p>
     <w:p>
@@ -1343,7 +1329,7 @@
           <w:rFonts w:ascii="Georgia" w:hAnsi="Georgia"/>
           <w:sz w:val="22"/>
         </w:rPr>
-        <w:t>`[CÁMARA]`: Very gentle slow push-in, medium to medium close-up. → counting briefly on her fingers, "Habla de derechos, contratos, cómo se reparte de verdad el dinero de Spotify, marca, hasta inteligencia artificial en la industria musical. Lo escribió IM Music, un sello discográfico independiente que está operando ahora mismo."</w:t>
+        <w:t>Recomendación directa — sin gestos, menciona "libro" sin que aparezca ninguno → sección 6, Clip 1</w:t>
       </w:r>
     </w:p>
     <w:p>
@@ -1355,7 +1341,19 @@
           <w:rFonts w:ascii="Georgia" w:hAnsi="Georgia"/>
           <w:sz w:val="22"/>
         </w:rPr>
-        <w:t>`[CÁMARA]`: (static camera, no movement) realistic arm movements. → holding up her hands slightly, "Dieciséis con noventa dólares, noventa y dos páginas. Por lo que cuesta, no hay comparación con lo que te puede ahorrar. Consíganlo antes de su próximo lanzamiento — link en bio."</w:t>
+        <w:t>Contenido + autoridad — cuenta con los dedos de la mano derecha, máximo 3 dedos doblados → sección 6, Clip 2</w:t>
+      </w:r>
+    </w:p>
+    <w:p>
+      <w:pPr>
+        <w:pStyle w:val="ListNumber"/>
+      </w:pPr>
+      <w:r>
+        <w:rPr>
+          <w:rFonts w:ascii="Georgia" w:hAnsi="Georgia"/>
+          <w:sz w:val="22"/>
+        </w:rPr>
+        <w:t>Precio + CTA — ambas manos se levantan juntas una sola vez, palmas abiertas, sin billetes/objetos → sección 6, Clip 3</w:t>
       </w:r>
     </w:p>
     <w:sectPr>

</xml_diff>

<commit_message>
docs: encadenar los clips de cada video para que se vean como una sola secuencia continua
Co-Authored-By: Claude Sonnet 5 <noreply@anthropic.com>
Claude-Session: https://claude.ai/code/session_01BGajP5s9F1aLgfyztSAp9Y
</commit_message>
<xml_diff>
--- a/docs/libro/Prompts_Creadora_IA_Video_Libro_IM_Music.docx
+++ b/docs/libro/Prompts_Creadora_IA_Video_Libro_IM_Music.docx
@@ -482,7 +482,7 @@
           <w:color w:val="333333"/>
           <w:sz w:val="19"/>
         </w:rPr>
-        <w:t>Slow, continuous zoom-in toward the subject's face, starting from the very first frame and moving steadily closer, then holding steady on the close-up for the rest of the clip. Single continuous take, no cuts or scene changes. Anatomically correct body at all times: exactly two arms and two hands, five fingers per hand, no extra, duplicated, blurred, or merged limbs, no distorted or morphing anatomy. Do not add any props, objects, books, papers, phones, or items that are not explicitly described in this prompt — her hands stay empty and either still or performing only the exact gesture written below, nothing appears out of nowhere. Natural steady eye contact with the camera, normal human blink rate, no jittery, rapid, wandering, crossed, or distorted eye movement. Any gesture must be slow, subtle, and anatomically natural — no exaggerated, rapid, jerky, or repeated movement, no extra limbs appearing during the gesture. In this clip she makes NO hand gestures at all — both hands and arms stay completely still, resting naturally out of frame or gently at her sides for the entire 10 seconds, never rising into view. Only her face moves: a serious, confessional expression, calm steady gaze locked on the camera, minimal natural head movement. She looks directly at the camera with a serious, confessional expression and says: "¿Sabes cuánto dinero de tu música se está quedando en el camino ahora mismo, sin que te enteres?"</w:t>
+        <w:t>Toma 1 de 4 de un solo video continuo, no una pieza aislada — el objetivo es que al unir las 4 tomas en edición se sienta como una sola toma que nunca se cortó. Starts on a medium shot, then a slow, continuous zoom-in over the full 10 seconds, ending exactly on a close-up. This ending close-up (exact distance, angle and head position) is the framing that Toma 2 must begin on, so the cut is invisible. Single continuous take, no cuts or scene changes. Anatomically correct body at all times: exactly two arms and two hands, five fingers per hand, no extra, duplicated, blurred, or merged limbs, no distorted or morphing anatomy. Do not add any props, objects, books, papers, phones, or items that are not explicitly described in this prompt — her hands stay empty and either still or performing only the exact gesture written below, nothing appears out of nowhere. Natural steady eye contact with the camera, normal human blink rate, no jittery, rapid, wandering, crossed, or distorted eye movement. Any gesture must be slow, subtle, and anatomically natural — no exaggerated, rapid, jerky, or repeated movement, no extra limbs appearing during the gesture. In this clip she makes NO hand gestures at all — both hands and arms stay completely still, resting naturally out of frame or gently at her sides for the entire 10 seconds, never rising into view. Only her face moves: a serious, confessional expression, calm steady gaze locked on the camera, minimal natural head movement. She looks directly at the camera with a serious, confessional expression and says: "¿Sabes cuánto dinero de tu música se está quedando en el camino ahora mismo, sin que te enteres?"</w:t>
         <w:br/>
         <w:br/>
         <w:t>Voice: a youthful female voice — a woman in her mid-20s, bright and fairly high-pitched, light and breezy, casual relaxed pace.</w:t>
@@ -517,7 +517,7 @@
           <w:color w:val="333333"/>
           <w:sz w:val="19"/>
         </w:rPr>
-        <w:t>(static camera, no movement) realistic arm movements and subtle micro-movements. Single continuous take, no cuts or scene changes. Anatomically correct body at all times: exactly two arms and two hands, five fingers per hand, no extra, duplicated, blurred, or merged limbs, no distorted or morphing anatomy. Do not add any props, objects, books, papers, phones, or items that are not explicitly described in this prompt — her hands stay empty and either still or performing only the exact gesture written below, nothing appears out of nowhere. Natural steady eye contact with the camera, normal human blink rate, no jittery, rapid, wandering, crossed, or distorted eye movement. Any gesture must be slow, subtle, and anatomically natural — no exaggerated, rapid, jerky, or repeated movement, no extra limbs appearing during the gesture. Only her RIGHT hand rises slowly from waist height to about chest height, palm loosely open, in one single smooth motion as she starts explaining, then it lowers back down and stays still for the rest of the clip — one continuous rise-and-settle, never repeating or flapping up and down. Her LEFT arm and hand stay completely still at her side the entire time, always out of frame or visibly resting, never rising, never duplicating the other hand's motion. At every single frame there are exactly two hands, five fingers each, no blurred or merged fingers. She raises one hand slightly as she explains, then says: "Cada vez que suena tu canción, hay un pago que te corresponde. Y la mayoría de artistas independientes nunca lo cobra."</w:t>
+        <w:t>Toma 2 de 4 de la misma secuencia continua (sigue exactamente después de la Toma 1, no reinicia). Starts already on the exact close-up framing where Toma 1 ended — same camera distance, same angle, same head position, as if this were one uninterrupted take that simply kept rolling. She continues speaking with the same conversational energy and momentum as the moment before — not a fresh restart, not a reset pose or reset breath. (static camera, no movement) realistic arm movements and subtle micro-movements. Single continuous take, no cuts or scene changes. Anatomically correct body at all times: exactly two arms and two hands, five fingers per hand, no extra, duplicated, blurred, or merged limbs, no distorted or morphing anatomy. Do not add any props, objects, books, papers, phones, or items that are not explicitly described in this prompt — her hands stay empty and either still or performing only the exact gesture written below, nothing appears out of nowhere. Natural steady eye contact with the camera, normal human blink rate, no jittery, rapid, wandering, crossed, or distorted eye movement. Any gesture must be slow, subtle, and anatomically natural — no exaggerated, rapid, jerky, or repeated movement, no extra limbs appearing during the gesture. Only her RIGHT hand rises slowly from waist height to about chest height, palm loosely open, in one single smooth motion as she starts explaining, then it lowers back down and stays still for the rest of the clip — one continuous rise-and-settle, never repeating or flapping up and down. Her LEFT arm and hand stay completely still at her side the entire time, always out of frame or visibly resting, never rising, never duplicating the other hand's motion. At every single frame there are exactly two hands, five fingers each, no blurred or merged fingers. She raises one hand slightly as she explains, then says: "Cada vez que suena tu canción, hay un pago que te corresponde. Y la mayoría de artistas independientes nunca lo cobra."</w:t>
         <w:br/>
         <w:br/>
         <w:t>Voice: a youthful female voice — a woman in her mid-20s, bright and fairly high-pitched, light and breezy, casual relaxed pace.</w:t>
@@ -552,7 +552,7 @@
           <w:color w:val="333333"/>
           <w:sz w:val="19"/>
         </w:rPr>
-        <w:t>Very gentle, almost imperceptible slow push-in on the speaker, from a medium shot to a medium close-up over the whole clip. Single continuous take, no cuts or scene changes. Anatomically correct body at all times: exactly two arms and two hands, five fingers per hand, no extra, duplicated, blurred, or merged limbs, no distorted or morphing anatomy. Do not add any props, objects, books, papers, phones, or items that are not explicitly described in this prompt — her hands stay empty and either still or performing only the exact gesture written below, nothing appears out of nowhere. Natural steady eye contact with the camera, normal human blink rate, no jittery, rapid, wandering, crossed, or distorted eye movement. Any gesture must be slow, subtle, and anatomically natural — no exaggerated, rapid, jerky, or repeated movement, no extra limbs appearing during the gesture. Both hands and arms stay completely still and out of frame or resting naturally for the entire clip — no hand ever becomes visible or gestures. Only her head moves, in one slow, single, natural nod, no repeated bobbing. Even though she says the word "libro" out loud, absolutely no physical book, object, or prop of any kind appears anywhere in the frame at any point — it is only spoken, nothing materializes in her hands or around her. She nods slowly with a knowing expression, then says: "No es falta de talento. Es que nadie te explicó cómo funciona el negocio detrás de la música. Por eso leí este libro."</w:t>
+        <w:t>Toma 3 de 4 de la misma secuencia continua (sigue exactamente después de la Toma 2, no reinicia). Starts on the same close-up where Toma 2 ended — same distance, same angle — then a very gentle, almost imperceptible push-in tightens slightly further over the 10 seconds, ending on a tighter close-up. This ending framing is what Toma 4 must begin on. Continues the same conversational energy as before, no restart. Single continuous take, no cuts or scene changes. Anatomically correct body at all times: exactly two arms and two hands, five fingers per hand, no extra, duplicated, blurred, or merged limbs, no distorted or morphing anatomy. Do not add any props, objects, books, papers, phones, or items that are not explicitly described in this prompt — her hands stay empty and either still or performing only the exact gesture written below, nothing appears out of nowhere. Natural steady eye contact with the camera, normal human blink rate, no jittery, rapid, wandering, crossed, or distorted eye movement. Any gesture must be slow, subtle, and anatomically natural — no exaggerated, rapid, jerky, or repeated movement, no extra limbs appearing during the gesture. Both hands and arms stay completely still and out of frame or resting naturally for the entire clip — no hand ever becomes visible or gestures. Only her head moves, in one slow, single, natural nod, no repeated bobbing. Even though she says the word "libro" out loud, absolutely no physical book, object, or prop of any kind appears anywhere in the frame at any point — it is only spoken, nothing materializes in her hands or around her. She nods slowly with a knowing expression, then says: "No es falta de talento. Es que nadie te explicó cómo funciona el negocio detrás de la música. Por eso leí este libro."</w:t>
         <w:br/>
         <w:br/>
         <w:t>Voice: a youthful female voice — a woman in her mid-20s, bright and fairly high-pitched, light and breezy, casual relaxed pace.</w:t>
@@ -587,7 +587,7 @@
           <w:color w:val="333333"/>
           <w:sz w:val="19"/>
         </w:rPr>
-        <w:t>(static camera, no movement) realistic arm movements and subtle micro-movements. Single continuous take, no cuts or scene changes. Anatomically correct body at all times: exactly two arms and two hands, five fingers per hand, no extra, duplicated, blurred, or merged limbs, no distorted or morphing anatomy. Do not add any props, objects, books, papers, phones, or items that are not explicitly described in this prompt — her hands stay empty and either still or performing only the exact gesture written below, nothing appears out of nowhere. Natural steady eye contact with the camera, normal human blink rate, no jittery, rapid, wandering, crossed, or distorted eye movement. Any gesture must be slow, subtle, and anatomically natural — no exaggerated, rapid, jerky, or repeated movement, no extra limbs appearing during the gesture. Only her RIGHT hand rises once, index finger extended, pointing up toward the top of the frame in one single smooth motion, then holds briefly and lowers — no repeated or jittery pointing. Her LEFT arm and hand stay completely still at her side the whole time, out of frame or resting, never appearing to move or duplicate. Exactly two hands visible at all times, five fingers each, no extra or blurred fingers on the pointing hand. No book, phone, or any object appears in her hand or in frame despite the book title being said aloud. She points up toward the top of the frame as she says: "Music Business Para Todos Los Humanos. Búscalo en el link de la bio antes de tu próximo lanzamiento, no después."</w:t>
+        <w:t>Toma 4 de 4, la última de esta secuencia continua (sigue exactamente después de la Toma 3, no reinicia). Starts already on the tighter close-up where Toma 3 ended — same distance, same angle. Static camera holds this exact framing for the close of the video. Continues the same conversational energy as before, no restart. (static camera, no movement) realistic arm movements and subtle micro-movements. Single continuous take, no cuts or scene changes. Anatomically correct body at all times: exactly two arms and two hands, five fingers per hand, no extra, duplicated, blurred, or merged limbs, no distorted or morphing anatomy. Do not add any props, objects, books, papers, phones, or items that are not explicitly described in this prompt — her hands stay empty and either still or performing only the exact gesture written below, nothing appears out of nowhere. Natural steady eye contact with the camera, normal human blink rate, no jittery, rapid, wandering, crossed, or distorted eye movement. Any gesture must be slow, subtle, and anatomically natural — no exaggerated, rapid, jerky, or repeated movement, no extra limbs appearing during the gesture. Only her RIGHT hand rises once, index finger extended, pointing up toward the top of the frame in one single smooth motion, then holds briefly and lowers — no repeated or jittery pointing. Her LEFT arm and hand stay completely still at her side the whole time, out of frame or resting, never appearing to move or duplicate. Exactly two hands visible at all times, five fingers each, no extra or blurred fingers on the pointing hand. No book, phone, or any object appears in her hand or in frame despite the book title being said aloud. She points up toward the top of the frame as she says: "Music Business Para Todos Los Humanos. Búscalo en el link de la bio antes de tu próximo lanzamiento, no después."</w:t>
         <w:br/>
         <w:br/>
         <w:t>Voice: a youthful female voice — a woman in her mid-20s, bright and fairly high-pitched, light and breezy, casual relaxed pace.</w:t>
@@ -648,7 +648,7 @@
           <w:color w:val="333333"/>
           <w:sz w:val="19"/>
         </w:rPr>
-        <w:t>Slow subtle push-in, cinematic. Single continuous take, no cuts or scene changes. Anatomically correct body at all times: exactly two arms and two hands, five fingers per hand, no extra, duplicated, blurred, or merged limbs, no distorted or morphing anatomy. Do not add any props, objects, books, papers, phones, or items that are not explicitly described in this prompt — her hands stay empty and either still or performing only the exact gesture written below, nothing appears out of nowhere. Natural steady eye contact with the camera, normal human blink rate, no jittery, rapid, wandering, crossed, or distorted eye movement. Any gesture must be slow, subtle, and anatomically natural — no exaggerated, rapid, jerky, or repeated movement, no extra limbs appearing during the gesture. Both hands and arms stay completely still and out of frame or resting naturally for the entire clip — no hand gesture at all. Only her head tilts once, slowly and slightly, in a single natural motion, no repeated tilting. She tilts her head curiously, then says: "Si haces música, hay algo que probablemente no sabes sobre tus regalías, tus contratos o tu marca."</w:t>
+        <w:t>Toma 1 de 3 de un solo video continuo — este es un video independiente del anterior, empieza su propia secuencia desde cero. Starts on a medium shot, slow subtle push-in, cinematic, ending exactly on a medium close-up. This ending framing is what Toma 2 must begin on, so the cut feels invisible. Single continuous take, no cuts or scene changes. Anatomically correct body at all times: exactly two arms and two hands, five fingers per hand, no extra, duplicated, blurred, or merged limbs, no distorted or morphing anatomy. Do not add any props, objects, books, papers, phones, or items that are not explicitly described in this prompt — her hands stay empty and either still or performing only the exact gesture written below, nothing appears out of nowhere. Natural steady eye contact with the camera, normal human blink rate, no jittery, rapid, wandering, crossed, or distorted eye movement. Any gesture must be slow, subtle, and anatomically natural — no exaggerated, rapid, jerky, or repeated movement, no extra limbs appearing during the gesture. Both hands and arms stay completely still and out of frame or resting naturally for the entire clip — no hand gesture at all. Only her head tilts once, slowly and slightly, in a single natural motion, no repeated tilting. She tilts her head curiously, then says: "Si haces música, hay algo que probablemente no sabes sobre tus regalías, tus contratos o tu marca."</w:t>
         <w:br/>
         <w:br/>
         <w:t>Voice: a youthful female voice — a woman in her mid-20s, bright and fairly high-pitched, light and breezy, casual relaxed pace.</w:t>
@@ -683,7 +683,7 @@
           <w:color w:val="333333"/>
           <w:sz w:val="19"/>
         </w:rPr>
-        <w:t>(static camera, no movement) realistic arm movements and subtle micro-movements. Single continuous take, no cuts or scene changes. Anatomically correct body at all times: exactly two arms and two hands, five fingers per hand, no extra, duplicated, blurred, or merged limbs, no distorted or morphing anatomy. Do not add any props, objects, books, papers, phones, or items that are not explicitly described in this prompt — her hands stay empty and either still or performing only the exact gesture written below, nothing appears out of nowhere. Natural steady eye contact with the camera, normal human blink rate, no jittery, rapid, wandering, crossed, or distorted eye movement. Any gesture must be slow, subtle, and anatomically natural — no exaggerated, rapid, jerky, or repeated movement, no extra limbs appearing during the gesture. Both hands and arms stay completely still and out of frame or resting naturally for the entire clip — no hand gesture at all. Only her expression changes into a slight, natural smile. Even though she says the word "libro" out loud, absolutely no physical book, object, or prop of any kind appears anywhere in the frame at any point — it is only spoken, nothing materializes in her hands or around her. She smiles slightly, then says: "Yo tampoco lo sabía, hasta que leí un libro que me cambió completamente cómo veo esto."</w:t>
+        <w:t>Toma 2 de 3 de la misma secuencia continua (sigue exactamente después de la Toma 1, no reinicia). Starts already on the exact medium close-up where Toma 1 ended — same distance, same angle — as if the take never cut. She continues speaking with the same conversational energy as before, not a fresh restart. (static camera, no movement) realistic arm movements and subtle micro-movements. Single continuous take, no cuts or scene changes. Anatomically correct body at all times: exactly two arms and two hands, five fingers per hand, no extra, duplicated, blurred, or merged limbs, no distorted or morphing anatomy. Do not add any props, objects, books, papers, phones, or items that are not explicitly described in this prompt — her hands stay empty and either still or performing only the exact gesture written below, nothing appears out of nowhere. Natural steady eye contact with the camera, normal human blink rate, no jittery, rapid, wandering, crossed, or distorted eye movement. Any gesture must be slow, subtle, and anatomically natural — no exaggerated, rapid, jerky, or repeated movement, no extra limbs appearing during the gesture. Both hands and arms stay completely still and out of frame or resting naturally for the entire clip — no hand gesture at all. Only her expression changes into a slight, natural smile. Even though she says the word "libro" out loud, absolutely no physical book, object, or prop of any kind appears anywhere in the frame at any point — it is only spoken, nothing materializes in her hands or around her. She smiles slightly, then says: "Yo tampoco lo sabía, hasta que leí un libro que me cambió completamente cómo veo esto."</w:t>
         <w:br/>
         <w:br/>
         <w:t>Voice: a youthful female voice — a woman in her mid-20s, bright and fairly high-pitched, light and breezy, casual relaxed pace.</w:t>
@@ -718,7 +718,7 @@
           <w:color w:val="333333"/>
           <w:sz w:val="19"/>
         </w:rPr>
-        <w:t>Slow, continuous zoom-in toward the subject's face, starting from the very first frame and moving steadily closer, then holding steady on the close-up for the rest of the clip. Single continuous take, no cuts or scene changes. Anatomically correct body at all times: exactly two arms and two hands, five fingers per hand, no extra, duplicated, blurred, or merged limbs, no distorted or morphing anatomy. Do not add any props, objects, books, papers, phones, or items that are not explicitly described in this prompt — her hands stay empty and either still or performing only the exact gesture written below, nothing appears out of nowhere. Natural steady eye contact with the camera, normal human blink rate, no jittery, rapid, wandering, crossed, or distorted eye movement. Any gesture must be slow, subtle, and anatomically natural — no exaggerated, rapid, jerky, or repeated movement, no extra limbs appearing during the gesture. Both hands and arms stay completely still and out of frame or resting naturally for the entire clip — no hand gesture at all. Even though the word "LIBRO" is said out loud as a comment keyword, absolutely no physical book, object, or prop of any kind appears anywhere in the frame at any point — it is only spoken, nothing materializes in her hands or around her. She says: "Si quieres que te cuente qué aprendí, comenta LIBRO y te cuento."</w:t>
+        <w:t>Toma 3 de 3, la última de esta secuencia continua (sigue exactamente después de la Toma 2, no reinicia). Starts on the same medium close-up where Toma 2 ended — same distance, same angle — then a slow, continuous zoom-in tightens further over the 10 seconds, ending on a close-up for this final comment-CTA. Continues the same conversational energy as before, no restart. Single continuous take, no cuts or scene changes. Anatomically correct body at all times: exactly two arms and two hands, five fingers per hand, no extra, duplicated, blurred, or merged limbs, no distorted or morphing anatomy. Do not add any props, objects, books, papers, phones, or items that are not explicitly described in this prompt — her hands stay empty and either still or performing only the exact gesture written below, nothing appears out of nowhere. Natural steady eye contact with the camera, normal human blink rate, no jittery, rapid, wandering, crossed, or distorted eye movement. Any gesture must be slow, subtle, and anatomically natural — no exaggerated, rapid, jerky, or repeated movement, no extra limbs appearing during the gesture. Both hands and arms stay completely still and out of frame or resting naturally for the entire clip — no hand gesture at all. Even though the word "LIBRO" is said out loud as a comment keyword, absolutely no physical book, object, or prop of any kind appears anywhere in the frame at any point — it is only spoken, nothing materializes in her hands or around her. She says: "Si quieres que te cuente qué aprendí, comenta LIBRO y te cuento."</w:t>
         <w:br/>
         <w:br/>
         <w:t>Voice: a youthful female voice — a woman in her mid-20s, bright and fairly high-pitched, light and breezy, casual relaxed pace.</w:t>
@@ -779,7 +779,7 @@
           <w:color w:val="333333"/>
           <w:sz w:val="19"/>
         </w:rPr>
-        <w:t>(static camera, no movement) realistic arm movements and subtle micro-movements. Single continuous take, no cuts or scene changes. Anatomically correct body at all times: exactly two arms and two hands, five fingers per hand, no extra, duplicated, blurred, or merged limbs, no distorted or morphing anatomy. Do not add any props, objects, books, papers, phones, or items that are not explicitly described in this prompt — her hands stay empty and either still or performing only the exact gesture written below, nothing appears out of nowhere. Natural steady eye contact with the camera, normal human blink rate, no jittery, rapid, wandering, crossed, or distorted eye movement. Any gesture must be slow, subtle, and anatomically natural — no exaggerated, rapid, jerky, or repeated movement, no extra limbs appearing during the gesture. Both hands and arms stay completely still and out of frame or resting naturally for the entire clip — no hand gesture at all. Only her expression carries direct, confident energy. Even though she says the word "libro" out loud, absolutely no physical book, object, or prop of any kind appears anywhere in the frame at any point — it is only spoken, nothing materializes in her hands or around her. She says with direct, confident energy: "Leí este libro y es excelente. Se los recomiendo."</w:t>
+        <w:t>Toma 1 de 3 de un solo video continuo — este es un video independiente de los anteriores, empieza su propia secuencia desde cero. Starts on a medium shot with direct, confident energy from the very first frame. Static camera holds this exact medium shot for the whole clip. This ending framing is what Toma 2 must begin on. (static camera, no movement) realistic arm movements and subtle micro-movements. Single continuous take, no cuts or scene changes. Anatomically correct body at all times: exactly two arms and two hands, five fingers per hand, no extra, duplicated, blurred, or merged limbs, no distorted or morphing anatomy. Do not add any props, objects, books, papers, phones, or items that are not explicitly described in this prompt — her hands stay empty and either still or performing only the exact gesture written below, nothing appears out of nowhere. Natural steady eye contact with the camera, normal human blink rate, no jittery, rapid, wandering, crossed, or distorted eye movement. Any gesture must be slow, subtle, and anatomically natural — no exaggerated, rapid, jerky, or repeated movement, no extra limbs appearing during the gesture. Both hands and arms stay completely still and out of frame or resting naturally for the entire clip — no hand gesture at all. Only her expression carries direct, confident energy. Even though she says the word "libro" out loud, absolutely no physical book, object, or prop of any kind appears anywhere in the frame at any point — it is only spoken, nothing materializes in her hands or around her. She says with direct, confident energy: "Leí este libro y es excelente. Se los recomiendo."</w:t>
         <w:br/>
         <w:br/>
         <w:t>Voice: a youthful female voice — a woman in her mid-20s, bright and fairly high-pitched, light and breezy, casual relaxed pace.</w:t>
@@ -825,7 +825,7 @@
           <w:color w:val="333333"/>
           <w:sz w:val="19"/>
         </w:rPr>
-        <w:t>Very gentle, almost imperceptible slow push-in on the speaker, from a medium shot to a medium close-up over the whole clip. Single continuous take, no cuts or scene changes. Anatomically correct body at all times: exactly two arms and two hands, five fingers per hand, no extra, duplicated, blurred, or merged limbs, no distorted or morphing anatomy. Do not add any props, objects, books, papers, phones, or items that are not explicitly described in this prompt — her hands stay empty and either still or performing only the exact gesture written below, nothing appears out of nowhere. Natural steady eye contact with the camera, normal human blink rate, no jittery, rapid, wandering, crossed, or distorted eye movement. Any gesture must be slow, subtle, and anatomically natural — no exaggerated, rapid, jerky, or repeated movement, no extra limbs appearing during the gesture. Only her RIGHT hand rises to about chest height and counts naturally, folding down one finger at a time (starting from an open palm) in slow, deliberate, natural counting motions — at most 3 fingers folded across the whole clip, always exactly five fingers visible on that hand, no extra or merged fingers, no repeated or jittery counting. Her LEFT arm and hand stay completely still at her side the entire time, out of frame or resting, never rising or duplicating. No book or any physical object appears in frame despite referring to who wrote it. She counts briefly on her fingers as she says: "Habla de derechos, contratos, cómo se reparte de verdad el dinero de Spotify, marca, hasta inteligencia artificial en la industria musical. Lo escribió IM Music, un sello discográfico independiente que está operando ahora mismo."</w:t>
+        <w:t>Toma 2 de 3 de la misma secuencia continua (sigue exactamente después de la Toma 1, no reinicia). Starts already on the exact medium shot where Toma 1 ended — same distance, same angle — as if the take never cut. A very gentle, almost imperceptible push-in tightens over the 10 seconds, ending on a medium close-up — this ending framing is what Toma 3 must begin on. Continues the same conversational energy as before, no restart. Single continuous take, no cuts or scene changes. Anatomically correct body at all times: exactly two arms and two hands, five fingers per hand, no extra, duplicated, blurred, or merged limbs, no distorted or morphing anatomy. Do not add any props, objects, books, papers, phones, or items that are not explicitly described in this prompt — her hands stay empty and either still or performing only the exact gesture written below, nothing appears out of nowhere. Natural steady eye contact with the camera, normal human blink rate, no jittery, rapid, wandering, crossed, or distorted eye movement. Any gesture must be slow, subtle, and anatomically natural — no exaggerated, rapid, jerky, or repeated movement, no extra limbs appearing during the gesture. Only her RIGHT hand rises to about chest height and counts naturally, folding down one finger at a time (starting from an open palm) in slow, deliberate, natural counting motions — at most 3 fingers folded across the whole clip, always exactly five fingers visible on that hand, no extra or merged fingers, no repeated or jittery counting. Her LEFT arm and hand stay completely still at her side the entire time, out of frame or resting, never rising or duplicating. No book or any physical object appears in frame despite referring to who wrote it. She counts briefly on her fingers as she says: "Habla de derechos, contratos, cómo se reparte de verdad el dinero de Spotify, marca, hasta inteligencia artificial en la industria musical. Lo escribió IM Music, un sello discográfico independiente que está operando ahora mismo."</w:t>
         <w:br/>
         <w:br/>
         <w:t>Voice: a youthful female voice — a woman in her mid-20s, bright and fairly high-pitched, light and breezy, casual relaxed pace.</w:t>
@@ -860,7 +860,7 @@
           <w:color w:val="333333"/>
           <w:sz w:val="19"/>
         </w:rPr>
-        <w:t>(static camera, no movement) realistic arm movements and subtle micro-movements. Single continuous take, no cuts or scene changes. Anatomically correct body at all times: exactly two arms and two hands, five fingers per hand, no extra, duplicated, blurred, or merged limbs, no distorted or morphing anatomy. Do not add any props, objects, books, papers, phones, or items that are not explicitly described in this prompt — her hands stay empty and either still or performing only the exact gesture written below, nothing appears out of nowhere. Natural steady eye contact with the camera, normal human blink rate, no jittery, rapid, wandering, crossed, or distorted eye movement. Any gesture must be slow, subtle, and anatomically natural — no exaggerated, rapid, jerky, or repeated movement, no extra limbs appearing during the gesture. Both hands rise together, gently and only once, from waist height to about chest height, palms open and relaxed facing the camera, fingers naturally spread (five per hand, ten total, no extra or merged fingers), hold briefly for a couple of seconds, then lower back down — a single smooth rise-hold-lower motion, no repeating, no flapping. No money, bills, phone, book, or any other object appears in her hands or in frame despite mentioning the price — her hands stay empty the whole time. She holds up her hands slightly as she says: "Dieciséis con noventa dólares, noventa y dos páginas. Por lo que cuesta, no hay comparación con lo que te puede ahorrar. Consíganlo antes de su próximo lanzamiento — link en bio."</w:t>
+        <w:t>Toma 3 de 3, la última de esta secuencia continua (sigue exactamente después de la Toma 2, no reinicia). Starts already on the exact medium close-up where Toma 2 ended — same distance, same angle. Static camera holds this framing for the close of the video. Continues the same conversational energy as before, no restart. (static camera, no movement) realistic arm movements and subtle micro-movements. Single continuous take, no cuts or scene changes. Anatomically correct body at all times: exactly two arms and two hands, five fingers per hand, no extra, duplicated, blurred, or merged limbs, no distorted or morphing anatomy. Do not add any props, objects, books, papers, phones, or items that are not explicitly described in this prompt — her hands stay empty and either still or performing only the exact gesture written below, nothing appears out of nowhere. Natural steady eye contact with the camera, normal human blink rate, no jittery, rapid, wandering, crossed, or distorted eye movement. Any gesture must be slow, subtle, and anatomically natural — no exaggerated, rapid, jerky, or repeated movement, no extra limbs appearing during the gesture. Both hands rise together, gently and only once, from waist height to about chest height, palms open and relaxed facing the camera, fingers naturally spread (five per hand, ten total, no extra or merged fingers), hold briefly for a couple of seconds, then lower back down — a single smooth rise-hold-lower motion, no repeating, no flapping. No money, bills, phone, book, or any other object appears in her hands or in frame despite mentioning the price — her hands stay empty the whole time. She holds up her hands slightly as she says: "Dieciséis con noventa dólares, noventa y dos páginas. Por lo que cuesta, no hay comparación con lo que te puede ahorrar. Consíganlo antes de su próximo lanzamiento — link en bio."</w:t>
         <w:br/>
         <w:br/>
         <w:t>Voice: a youthful female voice — a woman in her mid-20s, bright and fairly high-pitched, light and breezy, casual relaxed pace.</w:t>
@@ -891,9 +891,42 @@
       <w:r>
         <w:rPr>
           <w:rFonts w:ascii="Georgia" w:hAnsi="Georgia"/>
+          <w:b/>
+          <w:color w:val="5E17EB"/>
           <w:sz w:val="22"/>
         </w:rPr>
-        <w:t>Genera los 10 clips en orden (4 del video frío, 3 del tibio, 3 del caliente) usando siempre la misma imagen de referencia del paso 1.</w:t>
+        <w:t>Genera los clips EN ORDEN dentro de cada video</w:t>
+      </w:r>
+      <w:r>
+        <w:rPr>
+          <w:rFonts w:ascii="Georgia" w:hAnsi="Georgia"/>
+          <w:sz w:val="22"/>
+        </w:rPr>
+        <w:t xml:space="preserve"> (Toma 1, luego 2, luego 3...), usando siempre la misma imagen de referencia del paso 1. Cada prompt ya está escrito para que la Toma 2 empiece exactamente donde terminó la Toma 1 (mismo encuadre, misma energía) — por eso el orden importa: si generas fuera de orden pierdes esa continuidad.</w:t>
+      </w:r>
+    </w:p>
+    <w:p>
+      <w:pPr>
+        <w:pStyle w:val="ListBullet"/>
+      </w:pPr>
+      <w:r>
+        <w:rPr>
+          <w:rFonts w:ascii="Georgia" w:hAnsi="Georgia"/>
+          <w:sz w:val="22"/>
+        </w:rPr>
+        <w:t>Antes de generar la siguiente toma, mira cómo terminó la anterior (encuadre, distancia de cámara). Si el resultado real quedó distinto a lo descrito en el prompt (por ejemplo terminó en plano medio en vez de close-up), ajusta esa palabra en el prompt de la siguiente toma para que coincida con lo que realmente se ve — así el corte no salta.</w:t>
+      </w:r>
+    </w:p>
+    <w:p>
+      <w:pPr>
+        <w:pStyle w:val="ListBullet"/>
+      </w:pPr>
+      <w:r>
+        <w:rPr>
+          <w:rFonts w:ascii="Georgia" w:hAnsi="Georgia"/>
+          <w:sz w:val="22"/>
+        </w:rPr>
+        <w:t>Si un video completo (las 3-4 tomas juntas) no se siente como una sola secuencia al verlo seguido, regenera la toma que rompe la continuidad antes de seguir — no sigas generando las demás sobre una base que ya no encaja.</w:t>
       </w:r>
     </w:p>
     <w:p>

</xml_diff>

<commit_message>
docs: quitar gestos de manos complejos, muy dificiles de generar bien en Veo/Flow
Co-Authored-By: Claude Sonnet 5 <noreply@anthropic.com>
Claude-Session: https://claude.ai/code/session_01BGajP5s9F1aLgfyztSAp9Y
</commit_message>
<xml_diff>
--- a/docs/libro/Prompts_Creadora_IA_Video_Libro_IM_Music.docx
+++ b/docs/libro/Prompts_Creadora_IA_Video_Libro_IM_Music.docx
@@ -248,6 +248,186 @@
           <w:sz w:val="22"/>
         </w:rPr>
         <w:t xml:space="preserve"> el gorro de lana en violeta exacto `#5E17EB` es el elemento de marca principal — muy visible, siempre puesto como un beanie normal (nunca cubriendo la cara).</w:t>
+      </w:r>
+    </w:p>
+    <w:p>
+      <w:pPr>
+        <w:spacing w:before="360" w:after="160"/>
+      </w:pPr>
+      <w:r>
+        <w:rPr>
+          <w:rFonts w:ascii="Bahnschrift" w:hAnsi="Bahnschrift"/>
+          <w:b/>
+          <w:color w:val="5E17EB"/>
+          <w:sz w:val="32"/>
+        </w:rPr>
+        <w:t>⚠️ Ajuste por limitaciones reales de Google Flow / Veo</w:t>
+      </w:r>
+    </w:p>
+    <w:p>
+      <w:pPr>
+        <w:spacing w:after="160"/>
+      </w:pPr>
+      <w:r>
+        <w:rPr>
+          <w:rFonts w:ascii="Georgia" w:hAnsi="Georgia"/>
+          <w:sz w:val="22"/>
+        </w:rPr>
+        <w:t>Dos problemas que reportaste al generar con Google Flow, y cómo los resolvimos en este documento:</w:t>
+      </w:r>
+    </w:p>
+    <w:p>
+      <w:pPr>
+        <w:spacing w:after="160"/>
+      </w:pPr>
+      <w:r>
+        <w:rPr>
+          <w:rFonts w:ascii="Georgia" w:hAnsi="Georgia"/>
+          <w:b/>
+          <w:color w:val="5E17EB"/>
+          <w:sz w:val="22"/>
+        </w:rPr>
+        <w:t>1. Los dedos/movimientos de manos complejos casi nunca salen bien.</w:t>
+      </w:r>
+      <w:r>
+        <w:rPr>
+          <w:rFonts w:ascii="Georgia" w:hAnsi="Georgia"/>
+          <w:sz w:val="22"/>
+        </w:rPr>
+        <w:t xml:space="preserve"> Es una limitación conocida de estos modelos de video (no solo Veo — pasa con todos), no un error tuyo de prompt. La solución no es escribir un prompt más detallado sobre los dedos, es </w:t>
+      </w:r>
+      <w:r>
+        <w:rPr>
+          <w:rFonts w:ascii="Georgia" w:hAnsi="Georgia"/>
+          <w:b/>
+          <w:color w:val="5E17EB"/>
+          <w:sz w:val="22"/>
+        </w:rPr>
+        <w:t>quitar el movimiento de manos por completo</w:t>
+      </w:r>
+      <w:r>
+        <w:rPr>
+          <w:rFonts w:ascii="Georgia" w:hAnsi="Georgia"/>
+          <w:sz w:val="22"/>
+        </w:rPr>
+        <w:t>. Ya reescribí los 4 clips que tenían gestos de manos (subir la mano, apuntar, contar con los dedos, levantar ambas manos) para que ahora sus manos se queden quietas todo el clip, igual que los otros 6 que ya no tenían gesto. Vas a perder algo de dinamismo visual, pero vas a dejar de perder generaciones (y plata) en clips con manos deformes.</w:t>
+      </w:r>
+    </w:p>
+    <w:p>
+      <w:pPr>
+        <w:spacing w:after="160"/>
+      </w:pPr>
+      <w:r>
+        <w:rPr>
+          <w:rFonts w:ascii="Georgia" w:hAnsi="Georgia"/>
+          <w:b/>
+          <w:color w:val="5E17EB"/>
+          <w:sz w:val="22"/>
+        </w:rPr>
+        <w:t>2. La consistencia de voz/acento entre generaciones separadas es muy difícil de controlar en Flow.</w:t>
+      </w:r>
+      <w:r>
+        <w:rPr>
+          <w:rFonts w:ascii="Georgia" w:hAnsi="Georgia"/>
+          <w:sz w:val="22"/>
+        </w:rPr>
+        <w:t xml:space="preserve"> Cada clip se genera de forma independiente y el modelo de voz interno no "recuerda" cómo sonó en el clip anterior, así que aunque el texto de `Voice:`/`Accent:` sea idéntico, el tono real puede variar. La solución más confiable no es seguir ajustando ese texto — es </w:t>
+      </w:r>
+      <w:r>
+        <w:rPr>
+          <w:rFonts w:ascii="Georgia" w:hAnsi="Georgia"/>
+          <w:b/>
+          <w:color w:val="5E17EB"/>
+          <w:sz w:val="22"/>
+        </w:rPr>
+        <w:t>no depender del audio nativo de Veo</w:t>
+      </w:r>
+      <w:r>
+        <w:rPr>
+          <w:rFonts w:ascii="Georgia" w:hAnsi="Georgia"/>
+          <w:sz w:val="22"/>
+        </w:rPr>
+        <w:t>:</w:t>
+      </w:r>
+    </w:p>
+    <w:p>
+      <w:pPr>
+        <w:pStyle w:val="ListBullet"/>
+      </w:pPr>
+      <w:r>
+        <w:rPr>
+          <w:rFonts w:ascii="Georgia" w:hAnsi="Georgia"/>
+          <w:sz w:val="22"/>
+        </w:rPr>
+        <w:t xml:space="preserve">Genera los 10 clips igual (con el `says: "..."` para que la boca se mueva de forma coherente con esas palabras), pero al editar en CapCut </w:t>
+      </w:r>
+      <w:r>
+        <w:rPr>
+          <w:rFonts w:ascii="Georgia" w:hAnsi="Georgia"/>
+          <w:b/>
+          <w:color w:val="5E17EB"/>
+          <w:sz w:val="22"/>
+        </w:rPr>
+        <w:t>silencia el audio original de cada clip</w:t>
+      </w:r>
+      <w:r>
+        <w:rPr>
+          <w:rFonts w:ascii="Georgia" w:hAnsi="Georgia"/>
+          <w:sz w:val="22"/>
+        </w:rPr>
+        <w:t>.</w:t>
+      </w:r>
+    </w:p>
+    <w:p>
+      <w:pPr>
+        <w:pStyle w:val="ListBullet"/>
+      </w:pPr>
+      <w:r>
+        <w:rPr>
+          <w:rFonts w:ascii="Georgia" w:hAnsi="Georgia"/>
+          <w:sz w:val="22"/>
+        </w:rPr>
+        <w:t xml:space="preserve">Graba o genera UNA sola narración de voz en off, consistente, para las líneas de cada video — usando </w:t>
+      </w:r>
+      <w:r>
+        <w:rPr>
+          <w:rFonts w:ascii="Georgia" w:hAnsi="Georgia"/>
+          <w:b/>
+          <w:color w:val="5E17EB"/>
+          <w:sz w:val="22"/>
+        </w:rPr>
+        <w:t>edge-tts</w:t>
+      </w:r>
+      <w:r>
+        <w:rPr>
+          <w:rFonts w:ascii="Georgia" w:hAnsi="Georgia"/>
+          <w:sz w:val="22"/>
+        </w:rPr>
+        <w:t xml:space="preserve"> (ya está en el stack del proyecto) con la misma voz configurada una sola vez, o grabando tú/otra persona con un tono cercano al de la marca.</w:t>
+      </w:r>
+    </w:p>
+    <w:p>
+      <w:pPr>
+        <w:pStyle w:val="ListBullet"/>
+      </w:pPr>
+      <w:r>
+        <w:rPr>
+          <w:rFonts w:ascii="Georgia" w:hAnsi="Georgia"/>
+          <w:sz w:val="22"/>
+        </w:rPr>
+        <w:t>Pon esa narración como pista de audio sobre el video silenciado. El lipsync no va a ser perfecto al 100%, pero en formato reel/short con subtítulos quemados eso casi no se nota, y ganas voz 100% consistente en los 3 videos — que es lo que realmente rompe la ilusión de "una sola creadora" si varía.</w:t>
+      </w:r>
+    </w:p>
+    <w:p>
+      <w:pPr>
+        <w:pStyle w:val="ListBullet"/>
+      </w:pPr>
+      <w:r>
+        <w:rPr>
+          <w:rFonts w:ascii="Georgia" w:hAnsi="Georgia"/>
+          <w:sz w:val="22"/>
+        </w:rPr>
+        <w:t>Si prefieres mantener el audio nativo de Veo por ahora: genera cada clip 2-3 veces y quédate con el que suene más parecido a los demás, en vez de intentar forzarlo por prompt — el prompt ya está al máximo de lo que se puede controlar por texto.</w:t>
       </w:r>
     </w:p>
     <w:p>
@@ -517,7 +697,7 @@
           <w:color w:val="333333"/>
           <w:sz w:val="19"/>
         </w:rPr>
-        <w:t>Toma 2 de 4 de la misma secuencia continua (sigue exactamente después de la Toma 1, no reinicia). Starts already on the exact close-up framing where Toma 1 ended — same camera distance, same angle, same head position, as if this were one uninterrupted take that simply kept rolling. She continues speaking with the same conversational energy and momentum as the moment before — not a fresh restart, not a reset pose or reset breath. (static camera, no movement) realistic arm movements and subtle micro-movements. Single continuous take, no cuts or scene changes. Anatomically correct body at all times: exactly two arms and two hands, five fingers per hand, no extra, duplicated, blurred, or merged limbs, no distorted or morphing anatomy. Do not add any props, objects, books, papers, phones, or items that are not explicitly described in this prompt — her hands stay empty and either still or performing only the exact gesture written below, nothing appears out of nowhere. Natural steady eye contact with the camera, normal human blink rate, no jittery, rapid, wandering, crossed, or distorted eye movement. Any gesture must be slow, subtle, and anatomically natural — no exaggerated, rapid, jerky, or repeated movement, no extra limbs appearing during the gesture. Only her RIGHT hand rises slowly from waist height to about chest height, palm loosely open, in one single smooth motion as she starts explaining, then it lowers back down and stays still for the rest of the clip — one continuous rise-and-settle, never repeating or flapping up and down. Her LEFT arm and hand stay completely still at her side the entire time, always out of frame or visibly resting, never rising, never duplicating the other hand's motion. At every single frame there are exactly two hands, five fingers each, no blurred or merged fingers. She raises one hand slightly as she explains, then says: "Cada vez que suena tu canción, hay un pago que te corresponde. Y la mayoría de artistas independientes nunca lo cobra."</w:t>
+        <w:t>Toma 2 de 4 de la misma secuencia continua (sigue exactamente después de la Toma 1, no reinicia). Starts already on the exact close-up framing where Toma 1 ended — same camera distance, same angle, same head position, as if this were one uninterrupted take that simply kept rolling. She continues speaking with the same conversational energy and momentum as the moment before — not a fresh restart, not a reset pose or reset breath. (static camera, no movement) realistic arm movements and subtle micro-movements. Single continuous take, no cuts or scene changes. Anatomically correct body at all times: exactly two arms and two hands, five fingers per hand, no extra, duplicated, blurred, or merged limbs, no distorted or morphing anatomy. Do not add any props, objects, books, papers, phones, or items that are not explicitly described in this prompt — her hands stay empty and either still or performing only the exact gesture written below, nothing appears out of nowhere. Natural steady eye contact with the camera, normal human blink rate, no jittery, rapid, wandering, crossed, or distorted eye movement. Any gesture must be slow, subtle, and anatomically natural — no exaggerated, rapid, jerky, or repeated movement, no extra limbs appearing during the gesture. Both hands and arms stay completely still and out of frame or resting naturally for the entire clip — no hand gesture at all, no fingers visible moving. Only her face carries the explanation: eyebrows and expression shift naturally as she talks, calm steady gaze on the camera. She says with a slightly more intense, explanatory tone: "Cada vez que suena tu canción, hay un pago que te corresponde. Y la mayoría de artistas independientes nunca lo cobra."</w:t>
         <w:br/>
         <w:br/>
         <w:t>Voice: a youthful female voice — a woman in her mid-20s, bright and fairly high-pitched, light and breezy, casual relaxed pace.</w:t>
@@ -587,7 +767,7 @@
           <w:color w:val="333333"/>
           <w:sz w:val="19"/>
         </w:rPr>
-        <w:t>Toma 4 de 4, la última de esta secuencia continua (sigue exactamente después de la Toma 3, no reinicia). Starts already on the tighter close-up where Toma 3 ended — same distance, same angle. Static camera holds this exact framing for the close of the video. Continues the same conversational energy as before, no restart. (static camera, no movement) realistic arm movements and subtle micro-movements. Single continuous take, no cuts or scene changes. Anatomically correct body at all times: exactly two arms and two hands, five fingers per hand, no extra, duplicated, blurred, or merged limbs, no distorted or morphing anatomy. Do not add any props, objects, books, papers, phones, or items that are not explicitly described in this prompt — her hands stay empty and either still or performing only the exact gesture written below, nothing appears out of nowhere. Natural steady eye contact with the camera, normal human blink rate, no jittery, rapid, wandering, crossed, or distorted eye movement. Any gesture must be slow, subtle, and anatomically natural — no exaggerated, rapid, jerky, or repeated movement, no extra limbs appearing during the gesture. Only her RIGHT hand rises once, index finger extended, pointing up toward the top of the frame in one single smooth motion, then holds briefly and lowers — no repeated or jittery pointing. Her LEFT arm and hand stay completely still at her side the whole time, out of frame or resting, never appearing to move or duplicate. Exactly two hands visible at all times, five fingers each, no extra or blurred fingers on the pointing hand. No book, phone, or any object appears in her hand or in frame despite the book title being said aloud. She points up toward the top of the frame as she says: "Music Business Para Todos Los Humanos. Búscalo en el link de la bio antes de tu próximo lanzamiento, no después."</w:t>
+        <w:t>Toma 4 de 4, la última de esta secuencia continua (sigue exactamente después de la Toma 3, no reinicia). Starts already on the tighter close-up where Toma 3 ended — same distance, same angle. Static camera holds this exact framing for the close of the video. Continues the same conversational energy as before, no restart. (static camera, no movement) realistic arm movements and subtle micro-movements. Single continuous take, no cuts or scene changes. Anatomically correct body at all times: exactly two arms and two hands, five fingers per hand, no extra, duplicated, blurred, or merged limbs, no distorted or morphing anatomy. Do not add any props, objects, books, papers, phones, or items that are not explicitly described in this prompt — her hands stay empty and either still or performing only the exact gesture written below, nothing appears out of nowhere. Natural steady eye contact with the camera, normal human blink rate, no jittery, rapid, wandering, crossed, or distorted eye movement. Any gesture must be slow, subtle, and anatomically natural — no exaggerated, rapid, jerky, or repeated movement, no extra limbs appearing during the gesture. Both hands and arms stay completely still and out of frame or resting naturally for the entire clip — no hand gesture at all, no pointing, no fingers visible moving. Only her face and voice carry the call to action: confident, energetic expression, direct eye contact with the camera. No book, phone, or any object appears in frame despite the book title being said aloud. She says with confident, energetic emphasis: "Music Business Para Todos Los Humanos. Búscalo en el link de la bio antes de tu próximo lanzamiento, no después."</w:t>
         <w:br/>
         <w:br/>
         <w:t>Voice: a youthful female voice — a woman in her mid-20s, bright and fairly high-pitched, light and breezy, casual relaxed pace.</w:t>
@@ -825,7 +1005,7 @@
           <w:color w:val="333333"/>
           <w:sz w:val="19"/>
         </w:rPr>
-        <w:t>Toma 2 de 3 de la misma secuencia continua (sigue exactamente después de la Toma 1, no reinicia). Starts already on the exact medium shot where Toma 1 ended — same distance, same angle — as if the take never cut. A very gentle, almost imperceptible push-in tightens over the 10 seconds, ending on a medium close-up — this ending framing is what Toma 3 must begin on. Continues the same conversational energy as before, no restart. Single continuous take, no cuts or scene changes. Anatomically correct body at all times: exactly two arms and two hands, five fingers per hand, no extra, duplicated, blurred, or merged limbs, no distorted or morphing anatomy. Do not add any props, objects, books, papers, phones, or items that are not explicitly described in this prompt — her hands stay empty and either still or performing only the exact gesture written below, nothing appears out of nowhere. Natural steady eye contact with the camera, normal human blink rate, no jittery, rapid, wandering, crossed, or distorted eye movement. Any gesture must be slow, subtle, and anatomically natural — no exaggerated, rapid, jerky, or repeated movement, no extra limbs appearing during the gesture. Only her RIGHT hand rises to about chest height and counts naturally, folding down one finger at a time (starting from an open palm) in slow, deliberate, natural counting motions — at most 3 fingers folded across the whole clip, always exactly five fingers visible on that hand, no extra or merged fingers, no repeated or jittery counting. Her LEFT arm and hand stay completely still at her side the entire time, out of frame or resting, never rising or duplicating. No book or any physical object appears in frame despite referring to who wrote it. She counts briefly on her fingers as she says: "Habla de derechos, contratos, cómo se reparte de verdad el dinero de Spotify, marca, hasta inteligencia artificial en la industria musical. Lo escribió IM Music, un sello discográfico independiente que está operando ahora mismo."</w:t>
+        <w:t>Toma 2 de 3 de la misma secuencia continua (sigue exactamente después de la Toma 1, no reinicia). Starts already on the exact medium shot where Toma 1 ended — same distance, same angle — as if the take never cut. A very gentle, almost imperceptible push-in tightens over the 10 seconds, ending on a medium close-up — this ending framing is what Toma 3 must begin on. Continues the same conversational energy as before, no restart. Single continuous take, no cuts or scene changes. Anatomically correct body at all times: exactly two arms and two hands, five fingers per hand, no extra, duplicated, blurred, or merged limbs, no distorted or morphing anatomy. Do not add any props, objects, books, papers, phones, or items that are not explicitly described in this prompt — her hands stay empty and either still or performing only the exact gesture written below, nothing appears out of nowhere. Natural steady eye contact with the camera, normal human blink rate, no jittery, rapid, wandering, crossed, or distorted eye movement. Any gesture must be slow, subtle, and anatomically natural — no exaggerated, rapid, jerky, or repeated movement, no extra limbs appearing during the gesture. Both hands and arms stay completely still and out of frame or resting naturally for the entire clip — no hand gesture at all, no counting on fingers, no fingers visible moving. Only her face carries the list-like rhythm of the line: natural small head and eyebrow movement pacing each item, calm steady gaze on the camera. No book or any physical object appears in frame despite referring to who wrote it. She says with a clear, listing rhythm: "Habla de derechos, contratos, cómo se reparte de verdad el dinero de Spotify, marca, hasta inteligencia artificial en la industria musical. Lo escribió IM Music, un sello discográfico independiente que está operando ahora mismo."</w:t>
         <w:br/>
         <w:br/>
         <w:t>Voice: a youthful female voice — a woman in her mid-20s, bright and fairly high-pitched, light and breezy, casual relaxed pace.</w:t>
@@ -860,7 +1040,7 @@
           <w:color w:val="333333"/>
           <w:sz w:val="19"/>
         </w:rPr>
-        <w:t>Toma 3 de 3, la última de esta secuencia continua (sigue exactamente después de la Toma 2, no reinicia). Starts already on the exact medium close-up where Toma 2 ended — same distance, same angle. Static camera holds this framing for the close of the video. Continues the same conversational energy as before, no restart. (static camera, no movement) realistic arm movements and subtle micro-movements. Single continuous take, no cuts or scene changes. Anatomically correct body at all times: exactly two arms and two hands, five fingers per hand, no extra, duplicated, blurred, or merged limbs, no distorted or morphing anatomy. Do not add any props, objects, books, papers, phones, or items that are not explicitly described in this prompt — her hands stay empty and either still or performing only the exact gesture written below, nothing appears out of nowhere. Natural steady eye contact with the camera, normal human blink rate, no jittery, rapid, wandering, crossed, or distorted eye movement. Any gesture must be slow, subtle, and anatomically natural — no exaggerated, rapid, jerky, or repeated movement, no extra limbs appearing during the gesture. Both hands rise together, gently and only once, from waist height to about chest height, palms open and relaxed facing the camera, fingers naturally spread (five per hand, ten total, no extra or merged fingers), hold briefly for a couple of seconds, then lower back down — a single smooth rise-hold-lower motion, no repeating, no flapping. No money, bills, phone, book, or any other object appears in her hands or in frame despite mentioning the price — her hands stay empty the whole time. She holds up her hands slightly as she says: "Dieciséis con noventa dólares, noventa y dos páginas. Por lo que cuesta, no hay comparación con lo que te puede ahorrar. Consíganlo antes de su próximo lanzamiento — link en bio."</w:t>
+        <w:t>Toma 3 de 3, la última de esta secuencia continua (sigue exactamente después de la Toma 2, no reinicia). Starts already on the exact medium close-up where Toma 2 ended — same distance, same angle. Static camera holds this framing for the close of the video. Continues the same conversational energy as before, no restart. (static camera, no movement) realistic arm movements and subtle micro-movements. Single continuous take, no cuts or scene changes. Anatomically correct body at all times: exactly two arms and two hands, five fingers per hand, no extra, duplicated, blurred, or merged limbs, no distorted or morphing anatomy. Do not add any props, objects, books, papers, phones, or items that are not explicitly described in this prompt — her hands stay empty and either still or performing only the exact gesture written below, nothing appears out of nowhere. Natural steady eye contact with the camera, normal human blink rate, no jittery, rapid, wandering, crossed, or distorted eye movement. Any gesture must be slow, subtle, and anatomically natural — no exaggerated, rapid, jerky, or repeated movement, no extra limbs appearing during the gesture. Both hands and arms stay completely still and out of frame or resting naturally for the entire clip — no hand gesture at all, no fingers visible moving. Only her face and voice carry the closing energy: confident, direct expression, steady eye contact with the camera. No money, bills, phone, book, or any other object appears in frame despite mentioning the price. She says with confident, direct energy: "Dieciséis con noventa dólares, noventa y dos páginas. Por lo que cuesta, no hay comparación con lo que te puede ahorrar. Consíganlo antes de su próximo lanzamiento — link en bio."</w:t>
         <w:br/>
         <w:br/>
         <w:t>Voice: a youthful female voice — a woman in her mid-20s, bright and fairly high-pitched, light and breezy, casual relaxed pace.</w:t>
@@ -1248,7 +1428,7 @@
           <w:rFonts w:ascii="Georgia" w:hAnsi="Georgia"/>
           <w:sz w:val="22"/>
         </w:rPr>
-        <w:t>Agitación — sube solo la mano derecha una vez → sección 4, Clip 2</w:t>
+        <w:t>Agitación — sin gestos de manos, solo expresión → sección 4, Clip 2</w:t>
       </w:r>
     </w:p>
     <w:p>
@@ -1272,7 +1452,7 @@
           <w:rFonts w:ascii="Georgia" w:hAnsi="Georgia"/>
           <w:sz w:val="22"/>
         </w:rPr>
-        <w:t>CTA — apunta hacia arriba con la mano derecha → sección 4, Clip 4</w:t>
+        <w:t>CTA — sin gestos de manos, solo expresión y voz → sección 4, Clip 4</w:t>
       </w:r>
     </w:p>
     <w:p>
@@ -1374,7 +1554,7 @@
           <w:rFonts w:ascii="Georgia" w:hAnsi="Georgia"/>
           <w:sz w:val="22"/>
         </w:rPr>
-        <w:t>Contenido + autoridad — cuenta con los dedos de la mano derecha, máximo 3 dedos doblados → sección 6, Clip 2</w:t>
+        <w:t>Contenido + autoridad — sin gestos de manos, solo expresión con ritmo de lista → sección 6, Clip 2</w:t>
       </w:r>
     </w:p>
     <w:p>
@@ -1386,7 +1566,7 @@
           <w:rFonts w:ascii="Georgia" w:hAnsi="Georgia"/>
           <w:sz w:val="22"/>
         </w:rPr>
-        <w:t>Precio + CTA — ambas manos se levantan juntas una sola vez, palmas abiertas, sin billetes/objetos → sección 6, Clip 3</w:t>
+        <w:t>Precio + CTA — sin gestos de manos, solo expresión y voz, sin billetes/objetos → sección 6, Clip 3</w:t>
       </w:r>
     </w:p>
     <w:sectPr>

</xml_diff>

<commit_message>
docs: reemplazar audio nativo de Veo por doblaje consistente con edge-tts
Co-Authored-By: Claude Sonnet 5 <noreply@anthropic.com>
Claude-Session: https://claude.ai/code/session_01BGajP5s9F1aLgfyztSAp9Y
</commit_message>
<xml_diff>
--- a/docs/libro/Prompts_Creadora_IA_Video_Libro_IM_Music.docx
+++ b/docs/libro/Prompts_Creadora_IA_Video_Libro_IM_Music.docx
@@ -324,14 +324,52 @@
           <w:color w:val="5E17EB"/>
           <w:sz w:val="22"/>
         </w:rPr>
-        <w:t>2. La consistencia de voz/acento entre generaciones separadas es muy difícil de controlar en Flow.</w:t>
+        <w:t>2. La consistencia de voz/acento entre generaciones separadas es muy difícil de controlar en Flow — confirmado, ya lo probaste en más de 3 videos y sigue variando.</w:t>
       </w:r>
       <w:r>
         <w:rPr>
           <w:rFonts w:ascii="Georgia" w:hAnsi="Georgia"/>
           <w:sz w:val="22"/>
         </w:rPr>
-        <w:t xml:space="preserve"> Cada clip se genera de forma independiente y el modelo de voz interno no "recuerda" cómo sonó en el clip anterior, así que aunque el texto de `Voice:`/`Accent:` sea idéntico, el tono real puede variar. La solución más confiable no es seguir ajustando ese texto — es </w:t>
+        <w:t xml:space="preserve"> Esto no se arregla con más texto en el prompt: cada clip se genera de forma independiente y el modelo de voz interno de Veo no tiene memoria de cómo sonó en el clip anterior, así que aunque `Voice:`/`Accent:` sea idéntico palabra por palabra, el tono, el acento y hasta el ritmo pueden salir distintos cada vez. Seguir editando esa descripción no va a resolverlo — es un límite técnico de la herramienta, no de tu prompt.</w:t>
+      </w:r>
+    </w:p>
+    <w:p>
+      <w:pPr>
+        <w:spacing w:after="160"/>
+      </w:pPr>
+      <w:r>
+        <w:rPr>
+          <w:rFonts w:ascii="Georgia" w:hAnsi="Georgia"/>
+          <w:b/>
+          <w:color w:val="5E17EB"/>
+          <w:sz w:val="22"/>
+        </w:rPr>
+        <w:t>Por eso el plan ya no es "lograr que Veo genere la voz consistente" — es dejar de usar el audio de Veo del todo:</w:t>
+      </w:r>
+    </w:p>
+    <w:p>
+      <w:pPr>
+        <w:pStyle w:val="ListNumber"/>
+      </w:pPr>
+      <w:r>
+        <w:rPr>
+          <w:rFonts w:ascii="Georgia" w:hAnsi="Georgia"/>
+          <w:sz w:val="22"/>
+        </w:rPr>
+        <w:t>Genera los 10 clips igual que hasta ahora (con el `says: "..."` para que la boca se mueva de forma coherente con esas palabras) — el video/imagen sí es controlable, la voz nativa no.</w:t>
+      </w:r>
+    </w:p>
+    <w:p>
+      <w:pPr>
+        <w:pStyle w:val="ListNumber"/>
+      </w:pPr>
+      <w:r>
+        <w:rPr>
+          <w:rFonts w:ascii="Georgia" w:hAnsi="Georgia"/>
+          <w:sz w:val="22"/>
+        </w:rPr>
+        <w:t xml:space="preserve">En CapCut, </w:t>
       </w:r>
       <w:r>
         <w:rPr>
@@ -340,54 +378,26 @@
           <w:color w:val="5E17EB"/>
           <w:sz w:val="22"/>
         </w:rPr>
-        <w:t>no depender del audio nativo de Veo</w:t>
+        <w:t>silencia el audio original de cada uno de los 10 clips</w:t>
       </w:r>
       <w:r>
         <w:rPr>
           <w:rFonts w:ascii="Georgia" w:hAnsi="Georgia"/>
           <w:sz w:val="22"/>
         </w:rPr>
-        <w:t>:</w:t>
+        <w:t xml:space="preserve"> (mute de pista, no lo dejes de fondo ni bajito).</w:t>
       </w:r>
     </w:p>
     <w:p>
       <w:pPr>
-        <w:pStyle w:val="ListBullet"/>
+        <w:pStyle w:val="ListNumber"/>
       </w:pPr>
       <w:r>
         <w:rPr>
           <w:rFonts w:ascii="Georgia" w:hAnsi="Georgia"/>
           <w:sz w:val="22"/>
         </w:rPr>
-        <w:t xml:space="preserve">Genera los 10 clips igual (con el `says: "..."` para que la boca se mueva de forma coherente con esas palabras), pero al editar en CapCut </w:t>
-      </w:r>
-      <w:r>
-        <w:rPr>
-          <w:rFonts w:ascii="Georgia" w:hAnsi="Georgia"/>
-          <w:b/>
-          <w:color w:val="5E17EB"/>
-          <w:sz w:val="22"/>
-        </w:rPr>
-        <w:t>silencia el audio original de cada clip</w:t>
-      </w:r>
-      <w:r>
-        <w:rPr>
-          <w:rFonts w:ascii="Georgia" w:hAnsi="Georgia"/>
-          <w:sz w:val="22"/>
-        </w:rPr>
-        <w:t>.</w:t>
-      </w:r>
-    </w:p>
-    <w:p>
-      <w:pPr>
-        <w:pStyle w:val="ListBullet"/>
-      </w:pPr>
-      <w:r>
-        <w:rPr>
-          <w:rFonts w:ascii="Georgia" w:hAnsi="Georgia"/>
-          <w:sz w:val="22"/>
-        </w:rPr>
-        <w:t xml:space="preserve">Graba o genera UNA sola narración de voz en off, consistente, para las líneas de cada video — usando </w:t>
+        <w:t xml:space="preserve">Genera UNA sola narración de audio en off para todo el guion de cada video, de una sola vez, con </w:t>
       </w:r>
       <w:r>
         <w:rPr>
@@ -403,31 +413,43 @@
           <w:rFonts w:ascii="Georgia" w:hAnsi="Georgia"/>
           <w:sz w:val="22"/>
         </w:rPr>
-        <w:t xml:space="preserve"> (ya está en el stack del proyecto) con la misma voz configurada una sola vez, o grabando tú/otra persona con un tono cercano al de la marca.</w:t>
+        <w:t xml:space="preserve"> (ya está instalado en el proyecto) usando siempre la misma voz — por ejemplo `es-CO-SalomeNeural` (voz femenina colombiana de Microsoft, disponible en edge-tts). Como es la misma llamada al mismo motor, sale idéntica siempre: mismo tono, mismo acento, mismo ritmo, en los 3 videos.</w:t>
       </w:r>
     </w:p>
     <w:p>
       <w:pPr>
-        <w:pStyle w:val="ListBullet"/>
+        <w:pStyle w:val="ListNumber"/>
       </w:pPr>
       <w:r>
         <w:rPr>
           <w:rFonts w:ascii="Georgia" w:hAnsi="Georgia"/>
           <w:sz w:val="22"/>
         </w:rPr>
-        <w:t>Pon esa narración como pista de audio sobre el video silenciado. El lipsync no va a ser perfecto al 100%, pero en formato reel/short con subtítulos quemados eso casi no se nota, y ganas voz 100% consistente en los 3 videos — que es lo que realmente rompe la ilusión de "una sola creadora" si varía.</w:t>
+        <w:t>Corta esa narración en los mismos 3-4 fragmentos de cada video y ponla como pista de audio sobre el clip silenciado correspondiente.</w:t>
       </w:r>
     </w:p>
     <w:p>
       <w:pPr>
-        <w:pStyle w:val="ListBullet"/>
+        <w:pStyle w:val="ListNumber"/>
       </w:pPr>
       <w:r>
         <w:rPr>
           <w:rFonts w:ascii="Georgia" w:hAnsi="Georgia"/>
           <w:sz w:val="22"/>
         </w:rPr>
-        <w:t>Si prefieres mantener el audio nativo de Veo por ahora: genera cada clip 2-3 veces y quédate con el que suene más parecido a los demás, en vez de intentar forzarlo por prompt — el prompt ya está al máximo de lo que se puede controlar por texto.</w:t>
+        <w:t>El lipsync no va a calzar al 100%, pero en formato reel/short vertical con subtítulos quemados encima eso casi no se nota — y a cambio tienes voz perfectamente consistente en los 3 videos, que es lo que de verdad sostiene la ilusión de "una sola creadora recurrente".</w:t>
+      </w:r>
+    </w:p>
+    <w:p>
+      <w:pPr>
+        <w:spacing w:after="160"/>
+      </w:pPr>
+      <w:r>
+        <w:rPr>
+          <w:rFonts w:ascii="Georgia" w:hAnsi="Georgia"/>
+          <w:sz w:val="22"/>
+        </w:rPr>
+        <w:t>Si de verdad prefieres mantener el audio nativo de Veo, la única alternativa es generar cada clip 2-3 veces y quedarte con el que suene más parecido a los demás — pero dado que ya lo probaste en más de 3 videos sin resultado, te recomiendo pasar directo al doblaje con edge-tts en vez de seguir gastando generaciones en esto.</w:t>
       </w:r>
     </w:p>
     <w:p>

</xml_diff>